<commit_message>
Day 6–8: frontend renderer foundation, run-aware UI, and documentation updates
</commit_message>
<xml_diff>
--- a/docs/02_Data_Sources.docx
+++ b/docs/02_Data_Sources.docx
@@ -141,8 +141,19 @@
           <w:sz w:val="24"/>
           <w:szCs w:val="24"/>
         </w:rPr>
-        <w:t>rfid_events.json</w:t>
-      </w:r>
+        <w:t>rfid_</w:t>
+      </w:r>
+      <w:proofErr w:type="gramStart"/>
+      <w:r>
+        <w:rPr>
+          <w:rStyle w:val="HTMLCode"/>
+          <w:rFonts w:ascii="Times New Roman" w:hAnsi="Times New Roman" w:cs="Times New Roman"/>
+          <w:sz w:val="24"/>
+          <w:szCs w:val="24"/>
+        </w:rPr>
+        <w:t>events.json</w:t>
+      </w:r>
+      <w:proofErr w:type="gramEnd"/>
     </w:p>
     <w:p>
       <w:pPr>
@@ -747,8 +758,16 @@
     <w:p>
       <w:pPr>
         <w:pStyle w:val="Heading3"/>
-      </w:pPr>
-      <w:r>
+        <w:rPr>
+          <w:sz w:val="24"/>
+          <w:szCs w:val="24"/>
+        </w:rPr>
+      </w:pPr>
+      <w:r>
+        <w:rPr>
+          <w:sz w:val="24"/>
+          <w:szCs w:val="24"/>
+        </w:rPr>
         <w:lastRenderedPageBreak/>
         <w:t>Data Handoff: Ingestion → Feature Store</w:t>
       </w:r>
@@ -894,10 +913,121 @@
     </w:p>
     <w:p>
       <w:pPr>
-        <w:pStyle w:val="NormalWeb"/>
+        <w:pStyle w:val="Heading2"/>
+        <w:rPr>
+          <w:rFonts w:ascii="Times New Roman" w:hAnsi="Times New Roman" w:cs="Times New Roman"/>
+          <w:color w:val="auto"/>
+          <w:sz w:val="24"/>
+          <w:szCs w:val="24"/>
+        </w:rPr>
+      </w:pPr>
+      <w:r>
+        <w:rPr>
+          <w:rStyle w:val="Strong"/>
+          <w:rFonts w:ascii="Times New Roman" w:hAnsi="Times New Roman" w:cs="Times New Roman"/>
+          <w:bCs w:val="0"/>
+          <w:color w:val="auto"/>
+          <w:sz w:val="24"/>
+          <w:szCs w:val="24"/>
+        </w:rPr>
+        <w:t>Day-7 Update</w:t>
+      </w:r>
+    </w:p>
+    <w:p>
+      <w:pPr>
+        <w:pStyle w:val="NormalWeb"/>
+        <w:spacing w:before="0" w:beforeAutospacing="0" w:after="0" w:afterAutospacing="0"/>
+      </w:pPr>
+      <w:r>
+        <w:t>No new data sources were introduced or modified on Day-7.</w:t>
+      </w:r>
+    </w:p>
+    <w:p>
+      <w:pPr>
+        <w:pStyle w:val="NormalWeb"/>
+        <w:spacing w:before="0" w:beforeAutospacing="0" w:after="0" w:afterAutospacing="0"/>
+      </w:pPr>
+      <w:r>
+        <w:t xml:space="preserve">Frontend work strictly consumed </w:t>
+      </w:r>
+      <w:r>
+        <w:rPr>
+          <w:rStyle w:val="Strong"/>
+        </w:rPr>
+        <w:t>existing backend contracts and run metadata</w:t>
+      </w:r>
+      <w:r>
+        <w:t xml:space="preserve"> without altering data ingestion, storage, or feature semantics.</w:t>
+      </w:r>
+    </w:p>
+    <w:p>
+      <w:pPr>
+        <w:pStyle w:val="NormalWeb"/>
+        <w:spacing w:before="0" w:beforeAutospacing="0" w:after="0" w:afterAutospacing="0"/>
       </w:pPr>
       <w:bookmarkStart w:id="0" w:name="_GoBack"/>
       <w:bookmarkEnd w:id="0"/>
+    </w:p>
+    <w:p>
+      <w:pPr>
+        <w:pStyle w:val="Heading1"/>
+        <w:spacing w:before="0"/>
+        <w:rPr>
+          <w:rFonts w:ascii="Times New Roman" w:hAnsi="Times New Roman" w:cs="Times New Roman"/>
+          <w:b/>
+          <w:color w:val="auto"/>
+          <w:sz w:val="24"/>
+          <w:szCs w:val="24"/>
+        </w:rPr>
+      </w:pPr>
+      <w:r>
+        <w:rPr>
+          <w:rStyle w:val="Strong"/>
+          <w:rFonts w:ascii="Times New Roman" w:hAnsi="Times New Roman" w:cs="Times New Roman"/>
+          <w:bCs w:val="0"/>
+          <w:color w:val="auto"/>
+          <w:sz w:val="24"/>
+          <w:szCs w:val="24"/>
+        </w:rPr>
+        <w:t>Day-8 Note</w:t>
+      </w:r>
+    </w:p>
+    <w:p>
+      <w:pPr>
+        <w:pStyle w:val="NormalWeb"/>
+        <w:spacing w:before="0" w:beforeAutospacing="0" w:after="0" w:afterAutospacing="0"/>
+      </w:pPr>
+      <w:r>
+        <w:t>No new data sources introduced.</w:t>
+      </w:r>
+    </w:p>
+    <w:p>
+      <w:pPr>
+        <w:pStyle w:val="NormalWeb"/>
+        <w:spacing w:before="0" w:beforeAutospacing="0" w:after="0" w:afterAutospacing="0"/>
+      </w:pPr>
+      <w:r>
+        <w:t xml:space="preserve">Frontend now reflects ingestion context using </w:t>
+      </w:r>
+      <w:r>
+        <w:rPr>
+          <w:rStyle w:val="Strong"/>
+        </w:rPr>
+        <w:t>file-derived run identifiers</w:t>
+      </w:r>
+      <w:r>
+        <w:t>, improving traceability between data source and analysis.</w:t>
+      </w:r>
+    </w:p>
+    <w:p>
+      <w:pPr>
+        <w:pStyle w:val="NormalWeb"/>
+      </w:pPr>
+    </w:p>
+    <w:p>
+      <w:pPr>
+        <w:pStyle w:val="NormalWeb"/>
+      </w:pPr>
     </w:p>
     <w:p>
       <w:pPr>
@@ -3240,6 +3370,49 @@
     <w:name w:val="Normal"/>
     <w:qFormat/>
   </w:style>
+  <w:style w:type="paragraph" w:styleId="Heading1">
+    <w:name w:val="heading 1"/>
+    <w:basedOn w:val="Normal"/>
+    <w:next w:val="Normal"/>
+    <w:link w:val="Heading1Char"/>
+    <w:uiPriority w:val="9"/>
+    <w:qFormat/>
+    <w:rsid w:val="00C8790C"/>
+    <w:pPr>
+      <w:keepNext/>
+      <w:keepLines/>
+      <w:spacing w:before="240" w:after="0"/>
+      <w:outlineLvl w:val="0"/>
+    </w:pPr>
+    <w:rPr>
+      <w:rFonts w:asciiTheme="majorHAnsi" w:eastAsiaTheme="majorEastAsia" w:hAnsiTheme="majorHAnsi" w:cstheme="majorBidi"/>
+      <w:color w:val="2E74B5" w:themeColor="accent1" w:themeShade="BF"/>
+      <w:sz w:val="32"/>
+      <w:szCs w:val="32"/>
+    </w:rPr>
+  </w:style>
+  <w:style w:type="paragraph" w:styleId="Heading2">
+    <w:name w:val="heading 2"/>
+    <w:basedOn w:val="Normal"/>
+    <w:next w:val="Normal"/>
+    <w:link w:val="Heading2Char"/>
+    <w:uiPriority w:val="9"/>
+    <w:unhideWhenUsed/>
+    <w:qFormat/>
+    <w:rsid w:val="00D8754D"/>
+    <w:pPr>
+      <w:keepNext/>
+      <w:keepLines/>
+      <w:spacing w:before="40" w:after="0"/>
+      <w:outlineLvl w:val="1"/>
+    </w:pPr>
+    <w:rPr>
+      <w:rFonts w:asciiTheme="majorHAnsi" w:eastAsiaTheme="majorEastAsia" w:hAnsiTheme="majorHAnsi" w:cstheme="majorBidi"/>
+      <w:color w:val="2E74B5" w:themeColor="accent1" w:themeShade="BF"/>
+      <w:sz w:val="26"/>
+      <w:szCs w:val="26"/>
+    </w:rPr>
+  </w:style>
   <w:style w:type="paragraph" w:styleId="Heading3">
     <w:name w:val="heading 3"/>
     <w:basedOn w:val="Normal"/>
@@ -3347,6 +3520,32 @@
       <w:rFonts w:ascii="Courier New" w:eastAsia="Times New Roman" w:hAnsi="Courier New" w:cs="Courier New"/>
       <w:sz w:val="20"/>
       <w:szCs w:val="20"/>
+    </w:rPr>
+  </w:style>
+  <w:style w:type="character" w:customStyle="1" w:styleId="Heading2Char">
+    <w:name w:val="Heading 2 Char"/>
+    <w:basedOn w:val="DefaultParagraphFont"/>
+    <w:link w:val="Heading2"/>
+    <w:uiPriority w:val="9"/>
+    <w:rsid w:val="00D8754D"/>
+    <w:rPr>
+      <w:rFonts w:asciiTheme="majorHAnsi" w:eastAsiaTheme="majorEastAsia" w:hAnsiTheme="majorHAnsi" w:cstheme="majorBidi"/>
+      <w:color w:val="2E74B5" w:themeColor="accent1" w:themeShade="BF"/>
+      <w:sz w:val="26"/>
+      <w:szCs w:val="26"/>
+    </w:rPr>
+  </w:style>
+  <w:style w:type="character" w:customStyle="1" w:styleId="Heading1Char">
+    <w:name w:val="Heading 1 Char"/>
+    <w:basedOn w:val="DefaultParagraphFont"/>
+    <w:link w:val="Heading1"/>
+    <w:uiPriority w:val="9"/>
+    <w:rsid w:val="00C8790C"/>
+    <w:rPr>
+      <w:rFonts w:asciiTheme="majorHAnsi" w:eastAsiaTheme="majorEastAsia" w:hAnsiTheme="majorHAnsi" w:cstheme="majorBidi"/>
+      <w:color w:val="2E74B5" w:themeColor="accent1" w:themeShade="BF"/>
+      <w:sz w:val="32"/>
+      <w:szCs w:val="32"/>
     </w:rPr>
   </w:style>
 </w:styles>

</xml_diff>

<commit_message>
IPC consolidation, run-based UX enhancements, and frontend API integration
</commit_message>
<xml_diff>
--- a/docs/02_Data_Sources.docx
+++ b/docs/02_Data_Sources.docx
@@ -141,8 +141,19 @@
           <w:sz w:val="24"/>
           <w:szCs w:val="24"/>
         </w:rPr>
-        <w:t>rfid_events.json</w:t>
-      </w:r>
+        <w:t>rfid_</w:t>
+      </w:r>
+      <w:proofErr w:type="gramStart"/>
+      <w:r>
+        <w:rPr>
+          <w:rStyle w:val="HTMLCode"/>
+          <w:rFonts w:ascii="Times New Roman" w:hAnsi="Times New Roman" w:cs="Times New Roman"/>
+          <w:sz w:val="24"/>
+          <w:szCs w:val="24"/>
+        </w:rPr>
+        <w:t>events.json</w:t>
+      </w:r>
+      <w:proofErr w:type="gramEnd"/>
     </w:p>
     <w:p>
       <w:pPr>
@@ -1023,12 +1034,18 @@
       <w:pPr>
         <w:pStyle w:val="Heading3"/>
         <w:spacing w:before="0" w:beforeAutospacing="0" w:after="0" w:afterAutospacing="0"/>
+        <w:rPr>
+          <w:sz w:val="24"/>
+          <w:szCs w:val="24"/>
+        </w:rPr>
       </w:pPr>
       <w:r>
         <w:rPr>
           <w:rStyle w:val="Strong"/>
           <w:b/>
           <w:bCs/>
+          <w:sz w:val="24"/>
+          <w:szCs w:val="24"/>
         </w:rPr>
         <w:t>Data Source Status</w:t>
       </w:r>
@@ -1046,12 +1063,18 @@
       <w:pPr>
         <w:pStyle w:val="Heading3"/>
         <w:spacing w:before="0" w:beforeAutospacing="0" w:after="0" w:afterAutospacing="0"/>
+        <w:rPr>
+          <w:sz w:val="24"/>
+          <w:szCs w:val="24"/>
+        </w:rPr>
       </w:pPr>
       <w:r>
         <w:rPr>
           <w:rStyle w:val="Strong"/>
           <w:b/>
           <w:bCs/>
+          <w:sz w:val="24"/>
+          <w:szCs w:val="24"/>
         </w:rPr>
         <w:t>Notes</w:t>
       </w:r>
@@ -1099,12 +1122,18 @@
       <w:pPr>
         <w:pStyle w:val="Heading3"/>
         <w:spacing w:before="0" w:beforeAutospacing="0" w:after="0" w:afterAutospacing="0"/>
+        <w:rPr>
+          <w:sz w:val="24"/>
+          <w:szCs w:val="24"/>
+        </w:rPr>
       </w:pPr>
       <w:r>
         <w:rPr>
           <w:rStyle w:val="Strong"/>
           <w:b/>
           <w:bCs/>
+          <w:sz w:val="24"/>
+          <w:szCs w:val="24"/>
         </w:rPr>
         <w:t>Impact</w:t>
       </w:r>
@@ -1131,12 +1160,18 @@
     <w:p>
       <w:pPr>
         <w:pStyle w:val="Heading3"/>
+        <w:rPr>
+          <w:sz w:val="24"/>
+          <w:szCs w:val="24"/>
+        </w:rPr>
       </w:pPr>
       <w:r>
         <w:rPr>
           <w:rStyle w:val="Strong"/>
           <w:b/>
           <w:bCs/>
+          <w:sz w:val="24"/>
+          <w:szCs w:val="24"/>
         </w:rPr>
         <w:lastRenderedPageBreak/>
         <w:t>Data Sources – Day 10 Update</w:t>
@@ -1170,12 +1205,18 @@
     <w:p>
       <w:pPr>
         <w:pStyle w:val="Heading3"/>
+        <w:rPr>
+          <w:sz w:val="24"/>
+          <w:szCs w:val="24"/>
+        </w:rPr>
       </w:pPr>
       <w:r>
         <w:rPr>
           <w:rStyle w:val="Strong"/>
           <w:b/>
           <w:bCs/>
+          <w:sz w:val="24"/>
+          <w:szCs w:val="24"/>
         </w:rPr>
         <w:t>Data Sources – Day 11 Update</w:t>
       </w:r>
@@ -1213,12 +1254,18 @@
     <w:p>
       <w:pPr>
         <w:pStyle w:val="Heading3"/>
+        <w:rPr>
+          <w:sz w:val="24"/>
+          <w:szCs w:val="24"/>
+        </w:rPr>
       </w:pPr>
       <w:r>
         <w:rPr>
           <w:rStyle w:val="Strong"/>
           <w:b/>
           <w:bCs/>
+          <w:sz w:val="24"/>
+          <w:szCs w:val="24"/>
         </w:rPr>
         <w:t>Data Sources – Day 12 Update</w:t>
       </w:r>
@@ -1296,6 +1343,8 @@
           <w:rStyle w:val="Strong"/>
           <w:b/>
           <w:bCs/>
+          <w:sz w:val="24"/>
+          <w:szCs w:val="24"/>
         </w:rPr>
       </w:pPr>
     </w:p>
@@ -1306,6 +1355,8 @@
           <w:rStyle w:val="Strong"/>
           <w:b/>
           <w:bCs/>
+          <w:sz w:val="24"/>
+          <w:szCs w:val="24"/>
         </w:rPr>
       </w:pPr>
     </w:p>
@@ -1316,6 +1367,8 @@
           <w:rStyle w:val="Strong"/>
           <w:b/>
           <w:bCs/>
+          <w:sz w:val="24"/>
+          <w:szCs w:val="24"/>
         </w:rPr>
       </w:pPr>
     </w:p>
@@ -1326,6 +1379,8 @@
           <w:rStyle w:val="Strong"/>
           <w:b/>
           <w:bCs/>
+          <w:sz w:val="24"/>
+          <w:szCs w:val="24"/>
         </w:rPr>
       </w:pPr>
     </w:p>
@@ -1336,6 +1391,8 @@
           <w:rStyle w:val="Strong"/>
           <w:b/>
           <w:bCs/>
+          <w:sz w:val="24"/>
+          <w:szCs w:val="24"/>
         </w:rPr>
       </w:pPr>
     </w:p>
@@ -1346,18 +1403,26 @@
           <w:rStyle w:val="Strong"/>
           <w:b/>
           <w:bCs/>
+          <w:sz w:val="24"/>
+          <w:szCs w:val="24"/>
         </w:rPr>
       </w:pPr>
     </w:p>
     <w:p>
       <w:pPr>
         <w:pStyle w:val="Heading3"/>
+        <w:rPr>
+          <w:sz w:val="24"/>
+          <w:szCs w:val="24"/>
+        </w:rPr>
       </w:pPr>
       <w:r>
         <w:rPr>
           <w:rStyle w:val="Strong"/>
           <w:b/>
           <w:bCs/>
+          <w:sz w:val="24"/>
+          <w:szCs w:val="24"/>
         </w:rPr>
         <w:lastRenderedPageBreak/>
         <w:t>Data Sources – Day 13 Update</w:t>
@@ -1366,12 +1431,18 @@
     <w:p>
       <w:pPr>
         <w:pStyle w:val="Heading3"/>
+        <w:rPr>
+          <w:sz w:val="24"/>
+          <w:szCs w:val="24"/>
+        </w:rPr>
       </w:pPr>
       <w:r>
         <w:rPr>
           <w:rStyle w:val="Strong"/>
           <w:b/>
           <w:bCs/>
+          <w:sz w:val="24"/>
+          <w:szCs w:val="24"/>
         </w:rPr>
         <w:t>Operational Excel Usage</w:t>
       </w:r>
@@ -1441,12 +1512,18 @@
     <w:p>
       <w:pPr>
         <w:pStyle w:val="Heading3"/>
+        <w:rPr>
+          <w:sz w:val="24"/>
+          <w:szCs w:val="24"/>
+        </w:rPr>
       </w:pPr>
       <w:r>
         <w:rPr>
           <w:rStyle w:val="Strong"/>
           <w:b/>
           <w:bCs/>
+          <w:sz w:val="24"/>
+          <w:szCs w:val="24"/>
         </w:rPr>
         <w:t>System Impact</w:t>
       </w:r>
@@ -1514,12 +1591,18 @@
     <w:p>
       <w:pPr>
         <w:pStyle w:val="Heading3"/>
+        <w:rPr>
+          <w:sz w:val="24"/>
+          <w:szCs w:val="24"/>
+        </w:rPr>
       </w:pPr>
       <w:r>
         <w:rPr>
           <w:rStyle w:val="Strong"/>
           <w:b/>
           <w:bCs/>
+          <w:sz w:val="24"/>
+          <w:szCs w:val="24"/>
         </w:rPr>
         <w:t>Notes</w:t>
       </w:r>
@@ -1563,6 +1646,7 @@
     <w:p>
       <w:pPr>
         <w:pStyle w:val="NormalWeb"/>
+        <w:spacing w:before="0" w:beforeAutospacing="0" w:after="0" w:afterAutospacing="0"/>
         <w:rPr>
           <w:b/>
         </w:rPr>
@@ -1572,148 +1656,936 @@
           <w:b/>
         </w:rPr>
         <w:t>DAY-14</w:t>
+      </w:r>
+    </w:p>
+    <w:p>
+      <w:pPr>
+        <w:pStyle w:val="NormalWeb"/>
+        <w:spacing w:before="0" w:beforeAutospacing="0" w:after="0" w:afterAutospacing="0"/>
+        <w:rPr>
+          <w:b/>
+        </w:rPr>
+      </w:pPr>
+    </w:p>
+    <w:p>
+      <w:pPr>
+        <w:pStyle w:val="Heading3"/>
+        <w:spacing w:before="0" w:beforeAutospacing="0" w:after="0" w:afterAutospacing="0"/>
+        <w:rPr>
+          <w:sz w:val="24"/>
+          <w:szCs w:val="24"/>
+        </w:rPr>
+      </w:pPr>
+      <w:r>
+        <w:rPr>
+          <w:rStyle w:val="Strong"/>
+          <w:b/>
+          <w:bCs/>
+          <w:sz w:val="24"/>
+          <w:szCs w:val="24"/>
+        </w:rPr>
+        <w:t>Overview</w:t>
+      </w:r>
+    </w:p>
+    <w:p>
+      <w:pPr>
+        <w:pStyle w:val="NormalWeb"/>
+        <w:spacing w:before="0" w:beforeAutospacing="0" w:after="0" w:afterAutospacing="0"/>
+      </w:pPr>
+      <w:r>
+        <w:t>The Offline Industrial Data Intelligence System ingests structured and semi-structured industrial data from multiple operational sources to enable analytics, insights, and dashboards.</w:t>
+      </w:r>
+    </w:p>
+    <w:p>
+      <w:pPr>
+        <w:pStyle w:val="Heading3"/>
+        <w:spacing w:before="0" w:beforeAutospacing="0" w:after="0" w:afterAutospacing="0"/>
+        <w:rPr>
+          <w:sz w:val="24"/>
+          <w:szCs w:val="24"/>
+        </w:rPr>
+      </w:pPr>
+      <w:r>
+        <w:rPr>
+          <w:rStyle w:val="Strong"/>
+          <w:b/>
+          <w:bCs/>
+          <w:sz w:val="24"/>
+          <w:szCs w:val="24"/>
+        </w:rPr>
+        <w:t>Supported Data Sources</w:t>
+      </w:r>
+    </w:p>
+    <w:p>
+      <w:pPr>
+        <w:pStyle w:val="NormalWeb"/>
+        <w:spacing w:before="0" w:beforeAutospacing="0" w:after="0" w:afterAutospacing="0"/>
+      </w:pPr>
+      <w:r>
+        <w:t>• SAP maintenance exports</w:t>
+      </w:r>
+      <w:r>
+        <w:br/>
+        <w:t>• RFID machine logs</w:t>
+      </w:r>
+      <w:r>
+        <w:br/>
+        <w:t>• PLC snapshots</w:t>
+      </w:r>
+      <w:r>
+        <w:br/>
+        <w:t xml:space="preserve">• Energy consumption datasets (kWh / </w:t>
+      </w:r>
+      <w:proofErr w:type="spellStart"/>
+      <w:r>
+        <w:t>kVAh</w:t>
+      </w:r>
+      <w:proofErr w:type="spellEnd"/>
+      <w:r>
+        <w:t>)</w:t>
+      </w:r>
+      <w:r>
+        <w:br/>
+        <w:t>• Manual Excel-based operational records</w:t>
+      </w:r>
+    </w:p>
+    <w:p>
+      <w:pPr>
+        <w:pStyle w:val="Heading3"/>
+        <w:spacing w:before="0" w:beforeAutospacing="0" w:after="0" w:afterAutospacing="0"/>
+        <w:rPr>
+          <w:sz w:val="24"/>
+          <w:szCs w:val="24"/>
+        </w:rPr>
+      </w:pPr>
+      <w:r>
+        <w:rPr>
+          <w:rStyle w:val="Strong"/>
+          <w:b/>
+          <w:bCs/>
+          <w:sz w:val="24"/>
+          <w:szCs w:val="24"/>
+        </w:rPr>
+        <w:t>Data Handling Notes</w:t>
+      </w:r>
+    </w:p>
+    <w:p>
+      <w:pPr>
+        <w:pStyle w:val="NormalWeb"/>
+        <w:spacing w:before="0" w:beforeAutospacing="0" w:after="0" w:afterAutospacing="0"/>
+      </w:pPr>
+      <w:r>
+        <w:t xml:space="preserve">• Each ingestion generates a unique </w:t>
+      </w:r>
+      <w:r>
+        <w:rPr>
+          <w:rStyle w:val="Strong"/>
+        </w:rPr>
+        <w:t>Run ID</w:t>
+      </w:r>
+      <w:r>
+        <w:t>.</w:t>
+      </w:r>
+      <w:r>
+        <w:br/>
+        <w:t>• All downstream analytics (Insights, Dashboards, Exports) are strictly run-dependent.</w:t>
+      </w:r>
+      <w:r>
+        <w:br/>
+        <w:t>• Failed ingestions are isolated and routed to Data Health analysis.</w:t>
+      </w:r>
+    </w:p>
+    <w:p>
+      <w:pPr>
+        <w:pStyle w:val="Heading3"/>
+        <w:spacing w:before="0" w:beforeAutospacing="0" w:after="0" w:afterAutospacing="0"/>
+        <w:rPr>
+          <w:sz w:val="24"/>
+          <w:szCs w:val="24"/>
+        </w:rPr>
+      </w:pPr>
+      <w:r>
+        <w:rPr>
+          <w:rStyle w:val="Strong"/>
+          <w:b/>
+          <w:bCs/>
+          <w:sz w:val="24"/>
+          <w:szCs w:val="24"/>
+        </w:rPr>
+        <w:t>Current Status</w:t>
+      </w:r>
+    </w:p>
+    <w:p>
+      <w:pPr>
+        <w:pStyle w:val="NormalWeb"/>
+        <w:spacing w:before="0" w:beforeAutospacing="0" w:after="0" w:afterAutospacing="0"/>
+      </w:pPr>
+      <w:r>
+        <w:t>• Frontend ingestion flow finalized.</w:t>
+      </w:r>
+      <w:r>
+        <w:br/>
+        <w:t>• Backend ingestion and feature store implemented.</w:t>
+      </w:r>
+      <w:r>
+        <w:br/>
+        <w:t>• Schema validation and profiling to be extended in later phases.</w:t>
+      </w:r>
+    </w:p>
+    <w:p>
+      <w:pPr>
+        <w:pStyle w:val="NormalWeb"/>
+      </w:pPr>
+    </w:p>
+    <w:p>
+      <w:pPr>
+        <w:pStyle w:val="NormalWeb"/>
+      </w:pPr>
+    </w:p>
+    <w:p>
+      <w:pPr>
+        <w:pStyle w:val="Heading3"/>
+      </w:pPr>
+      <w:r>
+        <w:rPr>
+          <w:rStyle w:val="Strong"/>
+          <w:b/>
+          <w:bCs/>
+        </w:rPr>
+        <w:lastRenderedPageBreak/>
+        <w:t>Day 15 Update</w:t>
+      </w:r>
+    </w:p>
+    <w:p>
+      <w:pPr>
+        <w:pStyle w:val="NormalWeb"/>
+      </w:pPr>
+      <w:r>
+        <w:t xml:space="preserve">• Continued usage of </w:t>
+      </w:r>
+      <w:r>
+        <w:rPr>
+          <w:rStyle w:val="Strong"/>
+        </w:rPr>
+        <w:t>manual operational Excel files</w:t>
+      </w:r>
+      <w:r>
+        <w:t xml:space="preserve"> containing </w:t>
+      </w:r>
+      <w:r>
+        <w:rPr>
+          <w:rStyle w:val="Strong"/>
+        </w:rPr>
+        <w:t xml:space="preserve">kWh and </w:t>
+      </w:r>
+      <w:proofErr w:type="spellStart"/>
+      <w:r>
+        <w:rPr>
+          <w:rStyle w:val="Strong"/>
+        </w:rPr>
+        <w:t>kVAh</w:t>
+      </w:r>
+      <w:proofErr w:type="spellEnd"/>
+      <w:r>
+        <w:rPr>
+          <w:rStyle w:val="Strong"/>
+        </w:rPr>
+        <w:t xml:space="preserve"> readings</w:t>
+      </w:r>
+      <w:r>
+        <w:t>.</w:t>
+      </w:r>
+      <w:r>
+        <w:br/>
+        <w:t xml:space="preserve">• Energy data from </w:t>
+      </w:r>
+      <w:r>
+        <w:rPr>
+          <w:rStyle w:val="Strong"/>
+        </w:rPr>
+        <w:t>Driveline</w:t>
+      </w:r>
+      <w:r>
+        <w:t xml:space="preserve"> and </w:t>
+      </w:r>
+      <w:r>
+        <w:rPr>
+          <w:rStyle w:val="Strong"/>
+        </w:rPr>
+        <w:t>SMT Building</w:t>
+      </w:r>
+      <w:r>
+        <w:t xml:space="preserve"> machines was actively updated.</w:t>
+      </w:r>
+      <w:r>
+        <w:br/>
+        <w:t>• Power cost calculations derived from these readings were refined.</w:t>
+      </w:r>
+    </w:p>
+    <w:p>
+      <w:pPr>
+        <w:pStyle w:val="NormalWeb"/>
+      </w:pPr>
+      <w:r>
+        <w:rPr>
+          <w:rStyle w:val="Strong"/>
+        </w:rPr>
+        <w:t>Notes:</w:t>
+      </w:r>
+      <w:r>
+        <w:br/>
+        <w:t>• These Excel sheets remain operational data sources and are not yet ingested into the system.</w:t>
+      </w:r>
+      <w:r>
+        <w:br/>
+        <w:t>• Energy datasets are confirmed candidates for future energy efficiency and cost-related dashboards.</w:t>
+      </w:r>
+      <w:r>
+        <w:br/>
+        <w:t>• No new data sources were introduced on this day.</w:t>
+      </w:r>
+    </w:p>
+    <w:p>
+      <w:pPr>
+        <w:pStyle w:val="Heading3"/>
+      </w:pPr>
+      <w:r>
+        <w:rPr>
+          <w:rStyle w:val="Strong"/>
+          <w:b/>
+          <w:bCs/>
+        </w:rPr>
+        <w:t>Day 16 Update</w:t>
+      </w:r>
+    </w:p>
+    <w:p>
+      <w:pPr>
+        <w:pStyle w:val="NormalWeb"/>
+      </w:pPr>
+      <w:r>
+        <w:t xml:space="preserve">• Continued usage of </w:t>
+      </w:r>
+      <w:r>
+        <w:rPr>
+          <w:rStyle w:val="Strong"/>
+        </w:rPr>
+        <w:t>manual operational Excel sheets</w:t>
+      </w:r>
+      <w:r>
+        <w:t xml:space="preserve"> containing </w:t>
+      </w:r>
+      <w:r>
+        <w:rPr>
+          <w:rStyle w:val="Strong"/>
+        </w:rPr>
+        <w:t xml:space="preserve">kWh and </w:t>
+      </w:r>
+      <w:proofErr w:type="spellStart"/>
+      <w:r>
+        <w:rPr>
+          <w:rStyle w:val="Strong"/>
+        </w:rPr>
+        <w:t>kVAh</w:t>
+      </w:r>
+      <w:proofErr w:type="spellEnd"/>
+      <w:r>
+        <w:rPr>
+          <w:rStyle w:val="Strong"/>
+        </w:rPr>
+        <w:t xml:space="preserve"> energy readings</w:t>
+      </w:r>
+      <w:r>
+        <w:t xml:space="preserve"> for both </w:t>
+      </w:r>
+      <w:r>
+        <w:rPr>
+          <w:rStyle w:val="Strong"/>
+        </w:rPr>
+        <w:t>Driveline</w:t>
+      </w:r>
+      <w:r>
+        <w:t xml:space="preserve"> and </w:t>
+      </w:r>
+      <w:r>
+        <w:rPr>
+          <w:rStyle w:val="Strong"/>
+        </w:rPr>
+        <w:t>SMT Building</w:t>
+      </w:r>
+      <w:r>
+        <w:t>.</w:t>
+      </w:r>
+      <w:r>
+        <w:br/>
+        <w:t>• Power cost analysis sheets were updated based on current energy consumption values.</w:t>
+      </w:r>
+    </w:p>
+    <w:p>
+      <w:pPr>
+        <w:pStyle w:val="NormalWeb"/>
+      </w:pPr>
+      <w:r>
+        <w:rPr>
+          <w:rStyle w:val="Strong"/>
+        </w:rPr>
+        <w:t>Notes:</w:t>
+      </w:r>
+      <w:r>
+        <w:br/>
+        <w:t>• These Excel files remain operational data sources.</w:t>
+      </w:r>
+      <w:r>
+        <w:br/>
+        <w:t>• Energy and utility data continue to be strong candidates for future dashboards and analytics.</w:t>
+      </w:r>
+      <w:r>
+        <w:br/>
+        <w:t>• No new data sources were introduced on this day.</w:t>
+      </w:r>
+    </w:p>
+    <w:p>
+      <w:pPr>
+        <w:pStyle w:val="Heading3"/>
+      </w:pPr>
+      <w:r>
+        <w:rPr>
+          <w:rStyle w:val="Strong"/>
+          <w:b/>
+          <w:bCs/>
+        </w:rPr>
+        <w:t>Day 17 Update</w:t>
+      </w:r>
+    </w:p>
+    <w:p>
+      <w:pPr>
+        <w:pStyle w:val="NormalWeb"/>
+      </w:pPr>
+      <w:r>
+        <w:t xml:space="preserve">• Continued usage of </w:t>
+      </w:r>
+      <w:r>
+        <w:rPr>
+          <w:rStyle w:val="Strong"/>
+        </w:rPr>
+        <w:t>manual operational Excel sheets</w:t>
+      </w:r>
+      <w:r>
+        <w:t xml:space="preserve"> containing </w:t>
+      </w:r>
+      <w:r>
+        <w:rPr>
+          <w:rStyle w:val="Strong"/>
+        </w:rPr>
+        <w:t xml:space="preserve">kWh and </w:t>
+      </w:r>
+      <w:proofErr w:type="spellStart"/>
+      <w:r>
+        <w:rPr>
+          <w:rStyle w:val="Strong"/>
+        </w:rPr>
+        <w:t>kVAh</w:t>
+      </w:r>
+      <w:proofErr w:type="spellEnd"/>
+      <w:r>
+        <w:rPr>
+          <w:rStyle w:val="Strong"/>
+        </w:rPr>
+        <w:t xml:space="preserve"> readings</w:t>
+      </w:r>
+      <w:r>
+        <w:t xml:space="preserve"> for both </w:t>
+      </w:r>
+      <w:r>
+        <w:rPr>
+          <w:rStyle w:val="Strong"/>
+        </w:rPr>
+        <w:t>Driveline</w:t>
+      </w:r>
+      <w:r>
+        <w:t xml:space="preserve"> and </w:t>
+      </w:r>
+      <w:r>
+        <w:rPr>
+          <w:rStyle w:val="Strong"/>
+        </w:rPr>
+        <w:t>SMT Building</w:t>
+      </w:r>
+      <w:r>
+        <w:t>.</w:t>
+      </w:r>
+      <w:r>
+        <w:br/>
+        <w:t>• Power cost analysis sheets were finalized based on updated energy consumption data.</w:t>
+      </w:r>
+    </w:p>
+    <w:p>
+      <w:pPr>
+        <w:pStyle w:val="NormalWeb"/>
+      </w:pPr>
+      <w:r>
+        <w:rPr>
+          <w:rStyle w:val="Strong"/>
+        </w:rPr>
+        <w:t>Notes:</w:t>
+      </w:r>
+      <w:r>
+        <w:br/>
+        <w:t>• Energy data remains operational and manually maintained.</w:t>
+      </w:r>
+      <w:r>
+        <w:br/>
+        <w:t>• These datasets are strong candidates for future energy efficiency and Kaizen-based dashboards.</w:t>
+      </w:r>
+      <w:r>
+        <w:br/>
+        <w:t>• No new data sources were introduced on this day.</w:t>
+      </w:r>
+    </w:p>
+    <w:p>
+      <w:pPr>
+        <w:pStyle w:val="Heading3"/>
+      </w:pPr>
+      <w:r>
+        <w:rPr>
+          <w:rStyle w:val="Strong"/>
+          <w:b/>
+          <w:bCs/>
+        </w:rPr>
+        <w:t>Day 18 Update</w:t>
+      </w:r>
+    </w:p>
+    <w:p>
+      <w:pPr>
+        <w:pStyle w:val="NormalWeb"/>
+      </w:pPr>
+      <w:r>
+        <w:t xml:space="preserve">• Continued usage of </w:t>
+      </w:r>
+      <w:r>
+        <w:rPr>
+          <w:rStyle w:val="Strong"/>
+        </w:rPr>
+        <w:t>manual operational Excel sheets</w:t>
+      </w:r>
+      <w:r>
+        <w:t xml:space="preserve"> containing </w:t>
+      </w:r>
+      <w:r>
+        <w:rPr>
+          <w:rStyle w:val="Strong"/>
+        </w:rPr>
+        <w:t xml:space="preserve">kWh and </w:t>
+      </w:r>
+      <w:proofErr w:type="spellStart"/>
+      <w:r>
+        <w:rPr>
+          <w:rStyle w:val="Strong"/>
+        </w:rPr>
+        <w:t>kVAh</w:t>
+      </w:r>
+      <w:proofErr w:type="spellEnd"/>
+      <w:r>
+        <w:rPr>
+          <w:rStyle w:val="Strong"/>
+        </w:rPr>
+        <w:t xml:space="preserve"> energy readings</w:t>
+      </w:r>
+      <w:r>
+        <w:t xml:space="preserve"> for both </w:t>
+      </w:r>
+      <w:r>
+        <w:rPr>
+          <w:rStyle w:val="Strong"/>
+        </w:rPr>
+        <w:t>Driveline</w:t>
+      </w:r>
+      <w:r>
+        <w:t xml:space="preserve"> and </w:t>
+      </w:r>
+      <w:r>
+        <w:rPr>
+          <w:rStyle w:val="Strong"/>
+        </w:rPr>
+        <w:t>SMT Building</w:t>
+      </w:r>
+      <w:r>
+        <w:t>.</w:t>
+      </w:r>
+      <w:r>
+        <w:br/>
+        <w:t>• Power cost analysis sheets were updated based on current energy consumption data.</w:t>
+      </w:r>
+    </w:p>
+    <w:p>
+      <w:pPr>
+        <w:pStyle w:val="NormalWeb"/>
+      </w:pPr>
+      <w:r>
+        <w:rPr>
+          <w:rStyle w:val="Strong"/>
+        </w:rPr>
+        <w:t>Notes:</w:t>
+      </w:r>
+      <w:r>
+        <w:br/>
+        <w:t>• Energy datasets remain operational and manually maintained.</w:t>
+      </w:r>
+      <w:r>
+        <w:br/>
+        <w:t>• These datasets continue to be strong candidates for energy efficiency and audit-focused dashboards.</w:t>
+      </w:r>
+      <w:r>
+        <w:br/>
+        <w:t>• No new data sources were introduced on this day</w:t>
+      </w:r>
+    </w:p>
+    <w:p>
+      <w:pPr>
+        <w:pStyle w:val="Heading3"/>
+      </w:pPr>
+      <w:r>
+        <w:rPr>
+          <w:rStyle w:val="Strong"/>
+          <w:b/>
+          <w:bCs/>
+        </w:rPr>
+        <w:lastRenderedPageBreak/>
+        <w:t>Day 19 Update</w:t>
+      </w:r>
+    </w:p>
+    <w:p>
+      <w:pPr>
+        <w:pStyle w:val="NormalWeb"/>
+      </w:pPr>
+      <w:r>
+        <w:t xml:space="preserve">• Continued usage of </w:t>
+      </w:r>
+      <w:r>
+        <w:rPr>
+          <w:rStyle w:val="Strong"/>
+        </w:rPr>
+        <w:t>manual operational Excel sheets</w:t>
+      </w:r>
+      <w:r>
+        <w:t xml:space="preserve"> containing </w:t>
+      </w:r>
+      <w:r>
+        <w:rPr>
+          <w:rStyle w:val="Strong"/>
+        </w:rPr>
+        <w:t xml:space="preserve">kWh and </w:t>
+      </w:r>
+      <w:proofErr w:type="spellStart"/>
+      <w:r>
+        <w:rPr>
+          <w:rStyle w:val="Strong"/>
+        </w:rPr>
+        <w:t>kVAh</w:t>
+      </w:r>
+      <w:proofErr w:type="spellEnd"/>
+      <w:r>
+        <w:rPr>
+          <w:rStyle w:val="Strong"/>
+        </w:rPr>
+        <w:t xml:space="preserve"> energy readings</w:t>
+      </w:r>
+      <w:r>
+        <w:t xml:space="preserve"> for both </w:t>
+      </w:r>
+      <w:r>
+        <w:rPr>
+          <w:rStyle w:val="Strong"/>
+        </w:rPr>
+        <w:t>Driveline</w:t>
+      </w:r>
+      <w:r>
+        <w:t xml:space="preserve"> and </w:t>
+      </w:r>
+      <w:r>
+        <w:rPr>
+          <w:rStyle w:val="Strong"/>
+        </w:rPr>
+        <w:t>SMT Building</w:t>
+      </w:r>
+      <w:r>
+        <w:t>.</w:t>
+      </w:r>
+      <w:r>
+        <w:br/>
+        <w:t>• Power cost analysis sheets were updated based on current consumption values.</w:t>
+      </w:r>
+    </w:p>
+    <w:p>
+      <w:pPr>
+        <w:pStyle w:val="NormalWeb"/>
+      </w:pPr>
+      <w:r>
+        <w:rPr>
+          <w:rStyle w:val="Strong"/>
+        </w:rPr>
+        <w:t>Notes:</w:t>
+      </w:r>
+      <w:r>
+        <w:br/>
+        <w:t>• Energy data remains manually maintained and operational in nature.</w:t>
+      </w:r>
+      <w:r>
+        <w:br/>
+        <w:t>• These datasets continue to be strong candidates for energy efficiency and maintenance analytics dashboards.</w:t>
+      </w:r>
+      <w:r>
+        <w:br/>
+        <w:t>• No new data sources were introduced on this day.</w:t>
+      </w:r>
+    </w:p>
+    <w:p>
+      <w:pPr>
+        <w:pStyle w:val="Heading3"/>
+      </w:pPr>
+      <w:r>
+        <w:rPr>
+          <w:rStyle w:val="Strong"/>
+          <w:b/>
+          <w:bCs/>
+        </w:rPr>
+        <w:t>Day 20 Update</w:t>
+      </w:r>
+    </w:p>
+    <w:p>
+      <w:pPr>
+        <w:pStyle w:val="NormalWeb"/>
+      </w:pPr>
+      <w:r>
+        <w:t xml:space="preserve">• Continued usage of </w:t>
+      </w:r>
+      <w:r>
+        <w:rPr>
+          <w:rStyle w:val="Strong"/>
+        </w:rPr>
+        <w:t>manual operational Excel sheets</w:t>
+      </w:r>
+      <w:r>
+        <w:t xml:space="preserve"> containing </w:t>
+      </w:r>
+      <w:r>
+        <w:rPr>
+          <w:rStyle w:val="Strong"/>
+        </w:rPr>
+        <w:t xml:space="preserve">kWh and </w:t>
+      </w:r>
+      <w:proofErr w:type="spellStart"/>
+      <w:r>
+        <w:rPr>
+          <w:rStyle w:val="Strong"/>
+        </w:rPr>
+        <w:t>kVAh</w:t>
+      </w:r>
+      <w:proofErr w:type="spellEnd"/>
+      <w:r>
+        <w:rPr>
+          <w:rStyle w:val="Strong"/>
+        </w:rPr>
+        <w:t xml:space="preserve"> energy readings</w:t>
+      </w:r>
+      <w:r>
+        <w:t xml:space="preserve"> for both </w:t>
+      </w:r>
+      <w:r>
+        <w:rPr>
+          <w:rStyle w:val="Strong"/>
+        </w:rPr>
+        <w:t>Driveline</w:t>
+      </w:r>
+      <w:r>
+        <w:t xml:space="preserve"> and </w:t>
+      </w:r>
+      <w:r>
+        <w:rPr>
+          <w:rStyle w:val="Strong"/>
+        </w:rPr>
+        <w:t>SMT Building</w:t>
+      </w:r>
+      <w:r>
+        <w:t>.</w:t>
+      </w:r>
+      <w:r>
+        <w:br/>
+        <w:t>• Power cost analysis sheets were updated based on latest consumption values.</w:t>
+      </w:r>
+    </w:p>
+    <w:p>
+      <w:pPr>
+        <w:pStyle w:val="NormalWeb"/>
+      </w:pPr>
+      <w:r>
+        <w:rPr>
+          <w:rStyle w:val="Strong"/>
+        </w:rPr>
+        <w:t>Notes:</w:t>
+      </w:r>
+      <w:r>
+        <w:br/>
+        <w:t>• Energy datasets remain operational and manually maintained.</w:t>
+      </w:r>
+      <w:r>
+        <w:br/>
+        <w:t>• These datasets continue to be strong candidates for energy efficiency and machine-level analytics dashboards.</w:t>
+      </w:r>
+      <w:r>
+        <w:br/>
+        <w:t>• No new data sources were introduced on this day.</w:t>
+      </w:r>
+    </w:p>
+    <w:p>
+      <w:pPr>
+        <w:pStyle w:val="Heading3"/>
+      </w:pPr>
+      <w:r>
+        <w:rPr>
+          <w:rStyle w:val="Strong"/>
+          <w:b/>
+          <w:bCs/>
+        </w:rPr>
+        <w:t>Day 21 – Data Sources</w:t>
+      </w:r>
+    </w:p>
+    <w:p>
+      <w:pPr>
+        <w:pStyle w:val="NormalWeb"/>
+      </w:pPr>
+      <w:r>
+        <w:rPr>
+          <w:rStyle w:val="Strong"/>
+        </w:rPr>
+        <w:t>Data Sources Used:</w:t>
+      </w:r>
+    </w:p>
+    <w:p>
+      <w:pPr>
+        <w:pStyle w:val="NormalWeb"/>
+        <w:numPr>
+          <w:ilvl w:val="0"/>
+          <w:numId w:val="22"/>
+        </w:numPr>
+      </w:pPr>
+      <w:r>
+        <w:t xml:space="preserve">Energy meter readings (kWh, </w:t>
+      </w:r>
+      <w:proofErr w:type="spellStart"/>
+      <w:r>
+        <w:t>kVAh</w:t>
+      </w:r>
+      <w:proofErr w:type="spellEnd"/>
+      <w:r>
+        <w:t xml:space="preserve">) from </w:t>
+      </w:r>
+      <w:r>
+        <w:rPr>
+          <w:rStyle w:val="Strong"/>
+        </w:rPr>
+        <w:t>Driveline</w:t>
+      </w:r>
+      <w:r>
+        <w:t xml:space="preserve"> and </w:t>
+      </w:r>
+      <w:r>
+        <w:rPr>
+          <w:rStyle w:val="Strong"/>
+        </w:rPr>
+        <w:t>SMT buildings</w:t>
+      </w:r>
+      <w:r>
+        <w:t>.</w:t>
+      </w:r>
+    </w:p>
+    <w:p>
+      <w:pPr>
+        <w:pStyle w:val="NormalWeb"/>
+        <w:numPr>
+          <w:ilvl w:val="0"/>
+          <w:numId w:val="22"/>
+        </w:numPr>
+      </w:pPr>
+      <w:r>
+        <w:t>Power cost analysis sheets for consumption tracking.</w:t>
+      </w:r>
+    </w:p>
+    <w:p>
+      <w:pPr>
+        <w:pStyle w:val="NormalWeb"/>
+        <w:numPr>
+          <w:ilvl w:val="0"/>
+          <w:numId w:val="22"/>
+        </w:numPr>
+      </w:pPr>
+      <w:proofErr w:type="spellStart"/>
+      <w:r>
+        <w:t>DuckDB</w:t>
+      </w:r>
+      <w:proofErr w:type="spellEnd"/>
+      <w:r>
+        <w:t xml:space="preserve"> offline database tables for run metadata and system storage.</w:t>
+      </w:r>
+    </w:p>
+    <w:p>
+      <w:pPr>
+        <w:pStyle w:val="NormalWeb"/>
+      </w:pPr>
+      <w:r>
+        <w:rPr>
+          <w:rStyle w:val="Strong"/>
+        </w:rPr>
+        <w:t>Observations:</w:t>
+      </w:r>
+    </w:p>
+    <w:p>
+      <w:pPr>
+        <w:pStyle w:val="NormalWeb"/>
+        <w:numPr>
+          <w:ilvl w:val="0"/>
+          <w:numId w:val="23"/>
+        </w:numPr>
+      </w:pPr>
+      <w:r>
+        <w:t>Energy data entry process remains consistent and reliable.</w:t>
+      </w:r>
+    </w:p>
+    <w:p>
+      <w:pPr>
+        <w:pStyle w:val="NormalWeb"/>
+        <w:numPr>
+          <w:ilvl w:val="0"/>
+          <w:numId w:val="23"/>
+        </w:numPr>
+      </w:pPr>
+      <w:r>
+        <w:t>Database schema supports structured storage of industrial data sources.</w:t>
+      </w:r>
+    </w:p>
+    <w:p>
+      <w:pPr>
+        <w:pStyle w:val="NormalWeb"/>
+      </w:pPr>
+      <w:r>
+        <w:rPr>
+          <w:rStyle w:val="Strong"/>
+        </w:rPr>
+        <w:t>Conclusion:</w:t>
+      </w:r>
+    </w:p>
+    <w:p>
+      <w:pPr>
+        <w:pStyle w:val="NormalWeb"/>
+        <w:numPr>
+          <w:ilvl w:val="0"/>
+          <w:numId w:val="24"/>
+        </w:numPr>
+      </w:pPr>
+      <w:r>
+        <w:t>All required data sources are prepared for further ingestion and analysis stages.</w:t>
       </w:r>
       <w:bookmarkStart w:id="0" w:name="_GoBack"/>
       <w:bookmarkEnd w:id="0"/>
-    </w:p>
-    <w:p>
-      <w:pPr>
-        <w:pStyle w:val="Heading3"/>
-      </w:pPr>
-      <w:r>
-        <w:rPr>
-          <w:rStyle w:val="Strong"/>
-          <w:b/>
-          <w:bCs/>
-        </w:rPr>
-        <w:t>Overview</w:t>
-      </w:r>
-    </w:p>
-    <w:p>
-      <w:pPr>
-        <w:pStyle w:val="NormalWeb"/>
-      </w:pPr>
-      <w:r>
-        <w:t>The Offline Industrial Data Intelligence System ingests structured and semi-structured industrial data from multiple operational sources to enable analytics, insights, and dashboards.</w:t>
-      </w:r>
-    </w:p>
-    <w:p>
-      <w:pPr>
-        <w:pStyle w:val="Heading3"/>
-      </w:pPr>
-      <w:r>
-        <w:rPr>
-          <w:rStyle w:val="Strong"/>
-          <w:b/>
-          <w:bCs/>
-        </w:rPr>
-        <w:t>Supported Data Sources</w:t>
-      </w:r>
-    </w:p>
-    <w:p>
-      <w:pPr>
-        <w:pStyle w:val="NormalWeb"/>
-      </w:pPr>
-      <w:r>
-        <w:t>• SAP maintenance exports</w:t>
-      </w:r>
-      <w:r>
-        <w:br/>
-        <w:t>• RFID machine logs</w:t>
-      </w:r>
-      <w:r>
-        <w:br/>
-        <w:t>• PLC snapshots</w:t>
-      </w:r>
-      <w:r>
-        <w:br/>
-        <w:t xml:space="preserve">• Energy consumption datasets (kWh / </w:t>
-      </w:r>
-      <w:proofErr w:type="spellStart"/>
-      <w:r>
-        <w:t>kVAh</w:t>
-      </w:r>
-      <w:proofErr w:type="spellEnd"/>
-      <w:r>
-        <w:t>)</w:t>
-      </w:r>
-      <w:r>
-        <w:br/>
-        <w:t>• Manual Excel-based operational records</w:t>
-      </w:r>
-    </w:p>
-    <w:p>
-      <w:pPr>
-        <w:pStyle w:val="Heading3"/>
-      </w:pPr>
-      <w:r>
-        <w:rPr>
-          <w:rStyle w:val="Strong"/>
-          <w:b/>
-          <w:bCs/>
-        </w:rPr>
-        <w:t>Data Handling Notes</w:t>
-      </w:r>
-    </w:p>
-    <w:p>
-      <w:pPr>
-        <w:pStyle w:val="NormalWeb"/>
-      </w:pPr>
-      <w:r>
-        <w:t xml:space="preserve">• Each ingestion generates a unique </w:t>
-      </w:r>
-      <w:r>
-        <w:rPr>
-          <w:rStyle w:val="Strong"/>
-        </w:rPr>
-        <w:t>Run ID</w:t>
-      </w:r>
-      <w:r>
-        <w:t>.</w:t>
-      </w:r>
-      <w:r>
-        <w:br/>
-        <w:t>• All downstream analytics (Insights, Dashboards, Exports) are strictly run-dependent.</w:t>
-      </w:r>
-      <w:r>
-        <w:br/>
-        <w:t>• Failed ingestions are isolated and routed to Data Health analysis.</w:t>
-      </w:r>
-    </w:p>
-    <w:p>
-      <w:pPr>
-        <w:pStyle w:val="Heading3"/>
-      </w:pPr>
-      <w:r>
-        <w:rPr>
-          <w:rStyle w:val="Strong"/>
-          <w:b/>
-          <w:bCs/>
-        </w:rPr>
-        <w:t>Current Status</w:t>
-      </w:r>
-    </w:p>
-    <w:p>
-      <w:pPr>
-        <w:pStyle w:val="NormalWeb"/>
-      </w:pPr>
-      <w:r>
-        <w:lastRenderedPageBreak/>
-        <w:t>• Frontend ingestion flow finalized.</w:t>
-      </w:r>
-      <w:r>
-        <w:br/>
-        <w:t>• Backend ingestion and feature store implemented.</w:t>
-      </w:r>
-      <w:r>
-        <w:br/>
-        <w:t>• Schema validation and profiling to be extended in later phases.</w:t>
-      </w:r>
-    </w:p>
-    <w:p>
-      <w:pPr>
-        <w:pStyle w:val="NormalWeb"/>
-      </w:pPr>
     </w:p>
     <w:sectPr>
       <w:pgSz w:w="12240" w:h="15840"/>
@@ -2143,6 +3015,155 @@
     </w:lvl>
   </w:abstractNum>
   <w:abstractNum w:abstractNumId="3" w15:restartNumberingAfterBreak="0">
+    <w:nsid w:val="0E893F49"/>
+    <w:multiLevelType w:val="multilevel"/>
+    <w:tmpl w:val="42A40B34"/>
+    <w:lvl w:ilvl="0">
+      <w:start w:val="1"/>
+      <w:numFmt w:val="bullet"/>
+      <w:lvlText w:val=""/>
+      <w:lvlJc w:val="left"/>
+      <w:pPr>
+        <w:tabs>
+          <w:tab w:val="num" w:pos="720"/>
+        </w:tabs>
+        <w:ind w:left="720" w:hanging="360"/>
+      </w:pPr>
+      <w:rPr>
+        <w:rFonts w:ascii="Symbol" w:hAnsi="Symbol" w:hint="default"/>
+        <w:sz w:val="20"/>
+      </w:rPr>
+    </w:lvl>
+    <w:lvl w:ilvl="1" w:tentative="1">
+      <w:start w:val="1"/>
+      <w:numFmt w:val="bullet"/>
+      <w:lvlText w:val="o"/>
+      <w:lvlJc w:val="left"/>
+      <w:pPr>
+        <w:tabs>
+          <w:tab w:val="num" w:pos="1440"/>
+        </w:tabs>
+        <w:ind w:left="1440" w:hanging="360"/>
+      </w:pPr>
+      <w:rPr>
+        <w:rFonts w:ascii="Courier New" w:hAnsi="Courier New" w:hint="default"/>
+        <w:sz w:val="20"/>
+      </w:rPr>
+    </w:lvl>
+    <w:lvl w:ilvl="2" w:tentative="1">
+      <w:start w:val="1"/>
+      <w:numFmt w:val="bullet"/>
+      <w:lvlText w:val=""/>
+      <w:lvlJc w:val="left"/>
+      <w:pPr>
+        <w:tabs>
+          <w:tab w:val="num" w:pos="2160"/>
+        </w:tabs>
+        <w:ind w:left="2160" w:hanging="360"/>
+      </w:pPr>
+      <w:rPr>
+        <w:rFonts w:ascii="Wingdings" w:hAnsi="Wingdings" w:hint="default"/>
+        <w:sz w:val="20"/>
+      </w:rPr>
+    </w:lvl>
+    <w:lvl w:ilvl="3" w:tentative="1">
+      <w:start w:val="1"/>
+      <w:numFmt w:val="bullet"/>
+      <w:lvlText w:val=""/>
+      <w:lvlJc w:val="left"/>
+      <w:pPr>
+        <w:tabs>
+          <w:tab w:val="num" w:pos="2880"/>
+        </w:tabs>
+        <w:ind w:left="2880" w:hanging="360"/>
+      </w:pPr>
+      <w:rPr>
+        <w:rFonts w:ascii="Wingdings" w:hAnsi="Wingdings" w:hint="default"/>
+        <w:sz w:val="20"/>
+      </w:rPr>
+    </w:lvl>
+    <w:lvl w:ilvl="4" w:tentative="1">
+      <w:start w:val="1"/>
+      <w:numFmt w:val="bullet"/>
+      <w:lvlText w:val=""/>
+      <w:lvlJc w:val="left"/>
+      <w:pPr>
+        <w:tabs>
+          <w:tab w:val="num" w:pos="3600"/>
+        </w:tabs>
+        <w:ind w:left="3600" w:hanging="360"/>
+      </w:pPr>
+      <w:rPr>
+        <w:rFonts w:ascii="Wingdings" w:hAnsi="Wingdings" w:hint="default"/>
+        <w:sz w:val="20"/>
+      </w:rPr>
+    </w:lvl>
+    <w:lvl w:ilvl="5" w:tentative="1">
+      <w:start w:val="1"/>
+      <w:numFmt w:val="bullet"/>
+      <w:lvlText w:val=""/>
+      <w:lvlJc w:val="left"/>
+      <w:pPr>
+        <w:tabs>
+          <w:tab w:val="num" w:pos="4320"/>
+        </w:tabs>
+        <w:ind w:left="4320" w:hanging="360"/>
+      </w:pPr>
+      <w:rPr>
+        <w:rFonts w:ascii="Wingdings" w:hAnsi="Wingdings" w:hint="default"/>
+        <w:sz w:val="20"/>
+      </w:rPr>
+    </w:lvl>
+    <w:lvl w:ilvl="6" w:tentative="1">
+      <w:start w:val="1"/>
+      <w:numFmt w:val="bullet"/>
+      <w:lvlText w:val=""/>
+      <w:lvlJc w:val="left"/>
+      <w:pPr>
+        <w:tabs>
+          <w:tab w:val="num" w:pos="5040"/>
+        </w:tabs>
+        <w:ind w:left="5040" w:hanging="360"/>
+      </w:pPr>
+      <w:rPr>
+        <w:rFonts w:ascii="Wingdings" w:hAnsi="Wingdings" w:hint="default"/>
+        <w:sz w:val="20"/>
+      </w:rPr>
+    </w:lvl>
+    <w:lvl w:ilvl="7" w:tentative="1">
+      <w:start w:val="1"/>
+      <w:numFmt w:val="bullet"/>
+      <w:lvlText w:val=""/>
+      <w:lvlJc w:val="left"/>
+      <w:pPr>
+        <w:tabs>
+          <w:tab w:val="num" w:pos="5760"/>
+        </w:tabs>
+        <w:ind w:left="5760" w:hanging="360"/>
+      </w:pPr>
+      <w:rPr>
+        <w:rFonts w:ascii="Wingdings" w:hAnsi="Wingdings" w:hint="default"/>
+        <w:sz w:val="20"/>
+      </w:rPr>
+    </w:lvl>
+    <w:lvl w:ilvl="8" w:tentative="1">
+      <w:start w:val="1"/>
+      <w:numFmt w:val="bullet"/>
+      <w:lvlText w:val=""/>
+      <w:lvlJc w:val="left"/>
+      <w:pPr>
+        <w:tabs>
+          <w:tab w:val="num" w:pos="6480"/>
+        </w:tabs>
+        <w:ind w:left="6480" w:hanging="360"/>
+      </w:pPr>
+      <w:rPr>
+        <w:rFonts w:ascii="Wingdings" w:hAnsi="Wingdings" w:hint="default"/>
+        <w:sz w:val="20"/>
+      </w:rPr>
+    </w:lvl>
+  </w:abstractNum>
+  <w:abstractNum w:abstractNumId="4" w15:restartNumberingAfterBreak="0">
     <w:nsid w:val="199B7F89"/>
     <w:multiLevelType w:val="multilevel"/>
     <w:tmpl w:val="20AA80F2"/>
@@ -2291,7 +3312,7 @@
       </w:rPr>
     </w:lvl>
   </w:abstractNum>
-  <w:abstractNum w:abstractNumId="4" w15:restartNumberingAfterBreak="0">
+  <w:abstractNum w:abstractNumId="5" w15:restartNumberingAfterBreak="0">
     <w:nsid w:val="19A762C8"/>
     <w:multiLevelType w:val="multilevel"/>
     <w:tmpl w:val="A82E7BB4"/>
@@ -2440,7 +3461,7 @@
       </w:rPr>
     </w:lvl>
   </w:abstractNum>
-  <w:abstractNum w:abstractNumId="5" w15:restartNumberingAfterBreak="0">
+  <w:abstractNum w:abstractNumId="6" w15:restartNumberingAfterBreak="0">
     <w:nsid w:val="1AE27D26"/>
     <w:multiLevelType w:val="multilevel"/>
     <w:tmpl w:val="D3CA648A"/>
@@ -2589,7 +3610,7 @@
       </w:rPr>
     </w:lvl>
   </w:abstractNum>
-  <w:abstractNum w:abstractNumId="6" w15:restartNumberingAfterBreak="0">
+  <w:abstractNum w:abstractNumId="7" w15:restartNumberingAfterBreak="0">
     <w:nsid w:val="289E006F"/>
     <w:multiLevelType w:val="multilevel"/>
     <w:tmpl w:val="9F308DA0"/>
@@ -2706,7 +3727,7 @@
       </w:pPr>
     </w:lvl>
   </w:abstractNum>
-  <w:abstractNum w:abstractNumId="7" w15:restartNumberingAfterBreak="0">
+  <w:abstractNum w:abstractNumId="8" w15:restartNumberingAfterBreak="0">
     <w:nsid w:val="3BDC2785"/>
     <w:multiLevelType w:val="multilevel"/>
     <w:tmpl w:val="BE844A56"/>
@@ -2855,7 +3876,7 @@
       </w:rPr>
     </w:lvl>
   </w:abstractNum>
-  <w:abstractNum w:abstractNumId="8" w15:restartNumberingAfterBreak="0">
+  <w:abstractNum w:abstractNumId="9" w15:restartNumberingAfterBreak="0">
     <w:nsid w:val="3BDF28D1"/>
     <w:multiLevelType w:val="multilevel"/>
     <w:tmpl w:val="155497D2"/>
@@ -3004,7 +4025,156 @@
       </w:rPr>
     </w:lvl>
   </w:abstractNum>
-  <w:abstractNum w:abstractNumId="9" w15:restartNumberingAfterBreak="0">
+  <w:abstractNum w:abstractNumId="10" w15:restartNumberingAfterBreak="0">
+    <w:nsid w:val="42A8624D"/>
+    <w:multiLevelType w:val="multilevel"/>
+    <w:tmpl w:val="BAACE418"/>
+    <w:lvl w:ilvl="0">
+      <w:start w:val="1"/>
+      <w:numFmt w:val="bullet"/>
+      <w:lvlText w:val=""/>
+      <w:lvlJc w:val="left"/>
+      <w:pPr>
+        <w:tabs>
+          <w:tab w:val="num" w:pos="720"/>
+        </w:tabs>
+        <w:ind w:left="720" w:hanging="360"/>
+      </w:pPr>
+      <w:rPr>
+        <w:rFonts w:ascii="Symbol" w:hAnsi="Symbol" w:hint="default"/>
+        <w:sz w:val="20"/>
+      </w:rPr>
+    </w:lvl>
+    <w:lvl w:ilvl="1" w:tentative="1">
+      <w:start w:val="1"/>
+      <w:numFmt w:val="bullet"/>
+      <w:lvlText w:val="o"/>
+      <w:lvlJc w:val="left"/>
+      <w:pPr>
+        <w:tabs>
+          <w:tab w:val="num" w:pos="1440"/>
+        </w:tabs>
+        <w:ind w:left="1440" w:hanging="360"/>
+      </w:pPr>
+      <w:rPr>
+        <w:rFonts w:ascii="Courier New" w:hAnsi="Courier New" w:hint="default"/>
+        <w:sz w:val="20"/>
+      </w:rPr>
+    </w:lvl>
+    <w:lvl w:ilvl="2" w:tentative="1">
+      <w:start w:val="1"/>
+      <w:numFmt w:val="bullet"/>
+      <w:lvlText w:val=""/>
+      <w:lvlJc w:val="left"/>
+      <w:pPr>
+        <w:tabs>
+          <w:tab w:val="num" w:pos="2160"/>
+        </w:tabs>
+        <w:ind w:left="2160" w:hanging="360"/>
+      </w:pPr>
+      <w:rPr>
+        <w:rFonts w:ascii="Wingdings" w:hAnsi="Wingdings" w:hint="default"/>
+        <w:sz w:val="20"/>
+      </w:rPr>
+    </w:lvl>
+    <w:lvl w:ilvl="3" w:tentative="1">
+      <w:start w:val="1"/>
+      <w:numFmt w:val="bullet"/>
+      <w:lvlText w:val=""/>
+      <w:lvlJc w:val="left"/>
+      <w:pPr>
+        <w:tabs>
+          <w:tab w:val="num" w:pos="2880"/>
+        </w:tabs>
+        <w:ind w:left="2880" w:hanging="360"/>
+      </w:pPr>
+      <w:rPr>
+        <w:rFonts w:ascii="Wingdings" w:hAnsi="Wingdings" w:hint="default"/>
+        <w:sz w:val="20"/>
+      </w:rPr>
+    </w:lvl>
+    <w:lvl w:ilvl="4" w:tentative="1">
+      <w:start w:val="1"/>
+      <w:numFmt w:val="bullet"/>
+      <w:lvlText w:val=""/>
+      <w:lvlJc w:val="left"/>
+      <w:pPr>
+        <w:tabs>
+          <w:tab w:val="num" w:pos="3600"/>
+        </w:tabs>
+        <w:ind w:left="3600" w:hanging="360"/>
+      </w:pPr>
+      <w:rPr>
+        <w:rFonts w:ascii="Wingdings" w:hAnsi="Wingdings" w:hint="default"/>
+        <w:sz w:val="20"/>
+      </w:rPr>
+    </w:lvl>
+    <w:lvl w:ilvl="5" w:tentative="1">
+      <w:start w:val="1"/>
+      <w:numFmt w:val="bullet"/>
+      <w:lvlText w:val=""/>
+      <w:lvlJc w:val="left"/>
+      <w:pPr>
+        <w:tabs>
+          <w:tab w:val="num" w:pos="4320"/>
+        </w:tabs>
+        <w:ind w:left="4320" w:hanging="360"/>
+      </w:pPr>
+      <w:rPr>
+        <w:rFonts w:ascii="Wingdings" w:hAnsi="Wingdings" w:hint="default"/>
+        <w:sz w:val="20"/>
+      </w:rPr>
+    </w:lvl>
+    <w:lvl w:ilvl="6" w:tentative="1">
+      <w:start w:val="1"/>
+      <w:numFmt w:val="bullet"/>
+      <w:lvlText w:val=""/>
+      <w:lvlJc w:val="left"/>
+      <w:pPr>
+        <w:tabs>
+          <w:tab w:val="num" w:pos="5040"/>
+        </w:tabs>
+        <w:ind w:left="5040" w:hanging="360"/>
+      </w:pPr>
+      <w:rPr>
+        <w:rFonts w:ascii="Wingdings" w:hAnsi="Wingdings" w:hint="default"/>
+        <w:sz w:val="20"/>
+      </w:rPr>
+    </w:lvl>
+    <w:lvl w:ilvl="7" w:tentative="1">
+      <w:start w:val="1"/>
+      <w:numFmt w:val="bullet"/>
+      <w:lvlText w:val=""/>
+      <w:lvlJc w:val="left"/>
+      <w:pPr>
+        <w:tabs>
+          <w:tab w:val="num" w:pos="5760"/>
+        </w:tabs>
+        <w:ind w:left="5760" w:hanging="360"/>
+      </w:pPr>
+      <w:rPr>
+        <w:rFonts w:ascii="Wingdings" w:hAnsi="Wingdings" w:hint="default"/>
+        <w:sz w:val="20"/>
+      </w:rPr>
+    </w:lvl>
+    <w:lvl w:ilvl="8" w:tentative="1">
+      <w:start w:val="1"/>
+      <w:numFmt w:val="bullet"/>
+      <w:lvlText w:val=""/>
+      <w:lvlJc w:val="left"/>
+      <w:pPr>
+        <w:tabs>
+          <w:tab w:val="num" w:pos="6480"/>
+        </w:tabs>
+        <w:ind w:left="6480" w:hanging="360"/>
+      </w:pPr>
+      <w:rPr>
+        <w:rFonts w:ascii="Wingdings" w:hAnsi="Wingdings" w:hint="default"/>
+        <w:sz w:val="20"/>
+      </w:rPr>
+    </w:lvl>
+  </w:abstractNum>
+  <w:abstractNum w:abstractNumId="11" w15:restartNumberingAfterBreak="0">
     <w:nsid w:val="488C6048"/>
     <w:multiLevelType w:val="multilevel"/>
     <w:tmpl w:val="D0A2634A"/>
@@ -3153,7 +4323,7 @@
       </w:rPr>
     </w:lvl>
   </w:abstractNum>
-  <w:abstractNum w:abstractNumId="10" w15:restartNumberingAfterBreak="0">
+  <w:abstractNum w:abstractNumId="12" w15:restartNumberingAfterBreak="0">
     <w:nsid w:val="4A3D569D"/>
     <w:multiLevelType w:val="multilevel"/>
     <w:tmpl w:val="13D4042A"/>
@@ -3302,7 +4472,7 @@
       </w:rPr>
     </w:lvl>
   </w:abstractNum>
-  <w:abstractNum w:abstractNumId="11" w15:restartNumberingAfterBreak="0">
+  <w:abstractNum w:abstractNumId="13" w15:restartNumberingAfterBreak="0">
     <w:nsid w:val="4E0A27B5"/>
     <w:multiLevelType w:val="multilevel"/>
     <w:tmpl w:val="2DB49E70"/>
@@ -3451,7 +4621,156 @@
       </w:rPr>
     </w:lvl>
   </w:abstractNum>
-  <w:abstractNum w:abstractNumId="12" w15:restartNumberingAfterBreak="0">
+  <w:abstractNum w:abstractNumId="14" w15:restartNumberingAfterBreak="0">
+    <w:nsid w:val="5665309F"/>
+    <w:multiLevelType w:val="multilevel"/>
+    <w:tmpl w:val="F23A3184"/>
+    <w:lvl w:ilvl="0">
+      <w:start w:val="1"/>
+      <w:numFmt w:val="bullet"/>
+      <w:lvlText w:val=""/>
+      <w:lvlJc w:val="left"/>
+      <w:pPr>
+        <w:tabs>
+          <w:tab w:val="num" w:pos="720"/>
+        </w:tabs>
+        <w:ind w:left="720" w:hanging="360"/>
+      </w:pPr>
+      <w:rPr>
+        <w:rFonts w:ascii="Symbol" w:hAnsi="Symbol" w:hint="default"/>
+        <w:sz w:val="20"/>
+      </w:rPr>
+    </w:lvl>
+    <w:lvl w:ilvl="1" w:tentative="1">
+      <w:start w:val="1"/>
+      <w:numFmt w:val="bullet"/>
+      <w:lvlText w:val="o"/>
+      <w:lvlJc w:val="left"/>
+      <w:pPr>
+        <w:tabs>
+          <w:tab w:val="num" w:pos="1440"/>
+        </w:tabs>
+        <w:ind w:left="1440" w:hanging="360"/>
+      </w:pPr>
+      <w:rPr>
+        <w:rFonts w:ascii="Courier New" w:hAnsi="Courier New" w:hint="default"/>
+        <w:sz w:val="20"/>
+      </w:rPr>
+    </w:lvl>
+    <w:lvl w:ilvl="2" w:tentative="1">
+      <w:start w:val="1"/>
+      <w:numFmt w:val="bullet"/>
+      <w:lvlText w:val=""/>
+      <w:lvlJc w:val="left"/>
+      <w:pPr>
+        <w:tabs>
+          <w:tab w:val="num" w:pos="2160"/>
+        </w:tabs>
+        <w:ind w:left="2160" w:hanging="360"/>
+      </w:pPr>
+      <w:rPr>
+        <w:rFonts w:ascii="Wingdings" w:hAnsi="Wingdings" w:hint="default"/>
+        <w:sz w:val="20"/>
+      </w:rPr>
+    </w:lvl>
+    <w:lvl w:ilvl="3" w:tentative="1">
+      <w:start w:val="1"/>
+      <w:numFmt w:val="bullet"/>
+      <w:lvlText w:val=""/>
+      <w:lvlJc w:val="left"/>
+      <w:pPr>
+        <w:tabs>
+          <w:tab w:val="num" w:pos="2880"/>
+        </w:tabs>
+        <w:ind w:left="2880" w:hanging="360"/>
+      </w:pPr>
+      <w:rPr>
+        <w:rFonts w:ascii="Wingdings" w:hAnsi="Wingdings" w:hint="default"/>
+        <w:sz w:val="20"/>
+      </w:rPr>
+    </w:lvl>
+    <w:lvl w:ilvl="4" w:tentative="1">
+      <w:start w:val="1"/>
+      <w:numFmt w:val="bullet"/>
+      <w:lvlText w:val=""/>
+      <w:lvlJc w:val="left"/>
+      <w:pPr>
+        <w:tabs>
+          <w:tab w:val="num" w:pos="3600"/>
+        </w:tabs>
+        <w:ind w:left="3600" w:hanging="360"/>
+      </w:pPr>
+      <w:rPr>
+        <w:rFonts w:ascii="Wingdings" w:hAnsi="Wingdings" w:hint="default"/>
+        <w:sz w:val="20"/>
+      </w:rPr>
+    </w:lvl>
+    <w:lvl w:ilvl="5" w:tentative="1">
+      <w:start w:val="1"/>
+      <w:numFmt w:val="bullet"/>
+      <w:lvlText w:val=""/>
+      <w:lvlJc w:val="left"/>
+      <w:pPr>
+        <w:tabs>
+          <w:tab w:val="num" w:pos="4320"/>
+        </w:tabs>
+        <w:ind w:left="4320" w:hanging="360"/>
+      </w:pPr>
+      <w:rPr>
+        <w:rFonts w:ascii="Wingdings" w:hAnsi="Wingdings" w:hint="default"/>
+        <w:sz w:val="20"/>
+      </w:rPr>
+    </w:lvl>
+    <w:lvl w:ilvl="6" w:tentative="1">
+      <w:start w:val="1"/>
+      <w:numFmt w:val="bullet"/>
+      <w:lvlText w:val=""/>
+      <w:lvlJc w:val="left"/>
+      <w:pPr>
+        <w:tabs>
+          <w:tab w:val="num" w:pos="5040"/>
+        </w:tabs>
+        <w:ind w:left="5040" w:hanging="360"/>
+      </w:pPr>
+      <w:rPr>
+        <w:rFonts w:ascii="Wingdings" w:hAnsi="Wingdings" w:hint="default"/>
+        <w:sz w:val="20"/>
+      </w:rPr>
+    </w:lvl>
+    <w:lvl w:ilvl="7" w:tentative="1">
+      <w:start w:val="1"/>
+      <w:numFmt w:val="bullet"/>
+      <w:lvlText w:val=""/>
+      <w:lvlJc w:val="left"/>
+      <w:pPr>
+        <w:tabs>
+          <w:tab w:val="num" w:pos="5760"/>
+        </w:tabs>
+        <w:ind w:left="5760" w:hanging="360"/>
+      </w:pPr>
+      <w:rPr>
+        <w:rFonts w:ascii="Wingdings" w:hAnsi="Wingdings" w:hint="default"/>
+        <w:sz w:val="20"/>
+      </w:rPr>
+    </w:lvl>
+    <w:lvl w:ilvl="8" w:tentative="1">
+      <w:start w:val="1"/>
+      <w:numFmt w:val="bullet"/>
+      <w:lvlText w:val=""/>
+      <w:lvlJc w:val="left"/>
+      <w:pPr>
+        <w:tabs>
+          <w:tab w:val="num" w:pos="6480"/>
+        </w:tabs>
+        <w:ind w:left="6480" w:hanging="360"/>
+      </w:pPr>
+      <w:rPr>
+        <w:rFonts w:ascii="Wingdings" w:hAnsi="Wingdings" w:hint="default"/>
+        <w:sz w:val="20"/>
+      </w:rPr>
+    </w:lvl>
+  </w:abstractNum>
+  <w:abstractNum w:abstractNumId="15" w15:restartNumberingAfterBreak="0">
     <w:nsid w:val="57B21EED"/>
     <w:multiLevelType w:val="multilevel"/>
     <w:tmpl w:val="35EC1916"/>
@@ -3600,7 +4919,7 @@
       </w:rPr>
     </w:lvl>
   </w:abstractNum>
-  <w:abstractNum w:abstractNumId="13" w15:restartNumberingAfterBreak="0">
+  <w:abstractNum w:abstractNumId="16" w15:restartNumberingAfterBreak="0">
     <w:nsid w:val="59DB6D6A"/>
     <w:multiLevelType w:val="multilevel"/>
     <w:tmpl w:val="97FE5C9C"/>
@@ -3749,7 +5068,7 @@
       </w:rPr>
     </w:lvl>
   </w:abstractNum>
-  <w:abstractNum w:abstractNumId="14" w15:restartNumberingAfterBreak="0">
+  <w:abstractNum w:abstractNumId="17" w15:restartNumberingAfterBreak="0">
     <w:nsid w:val="5E855459"/>
     <w:multiLevelType w:val="multilevel"/>
     <w:tmpl w:val="30F2FFFC"/>
@@ -3898,7 +5217,156 @@
       </w:rPr>
     </w:lvl>
   </w:abstractNum>
-  <w:abstractNum w:abstractNumId="15" w15:restartNumberingAfterBreak="0">
+  <w:abstractNum w:abstractNumId="18" w15:restartNumberingAfterBreak="0">
+    <w:nsid w:val="61BF3478"/>
+    <w:multiLevelType w:val="multilevel"/>
+    <w:tmpl w:val="22B02AC8"/>
+    <w:lvl w:ilvl="0">
+      <w:start w:val="1"/>
+      <w:numFmt w:val="bullet"/>
+      <w:lvlText w:val=""/>
+      <w:lvlJc w:val="left"/>
+      <w:pPr>
+        <w:tabs>
+          <w:tab w:val="num" w:pos="720"/>
+        </w:tabs>
+        <w:ind w:left="720" w:hanging="360"/>
+      </w:pPr>
+      <w:rPr>
+        <w:rFonts w:ascii="Symbol" w:hAnsi="Symbol" w:hint="default"/>
+        <w:sz w:val="20"/>
+      </w:rPr>
+    </w:lvl>
+    <w:lvl w:ilvl="1" w:tentative="1">
+      <w:start w:val="1"/>
+      <w:numFmt w:val="bullet"/>
+      <w:lvlText w:val="o"/>
+      <w:lvlJc w:val="left"/>
+      <w:pPr>
+        <w:tabs>
+          <w:tab w:val="num" w:pos="1440"/>
+        </w:tabs>
+        <w:ind w:left="1440" w:hanging="360"/>
+      </w:pPr>
+      <w:rPr>
+        <w:rFonts w:ascii="Courier New" w:hAnsi="Courier New" w:hint="default"/>
+        <w:sz w:val="20"/>
+      </w:rPr>
+    </w:lvl>
+    <w:lvl w:ilvl="2" w:tentative="1">
+      <w:start w:val="1"/>
+      <w:numFmt w:val="bullet"/>
+      <w:lvlText w:val=""/>
+      <w:lvlJc w:val="left"/>
+      <w:pPr>
+        <w:tabs>
+          <w:tab w:val="num" w:pos="2160"/>
+        </w:tabs>
+        <w:ind w:left="2160" w:hanging="360"/>
+      </w:pPr>
+      <w:rPr>
+        <w:rFonts w:ascii="Wingdings" w:hAnsi="Wingdings" w:hint="default"/>
+        <w:sz w:val="20"/>
+      </w:rPr>
+    </w:lvl>
+    <w:lvl w:ilvl="3" w:tentative="1">
+      <w:start w:val="1"/>
+      <w:numFmt w:val="bullet"/>
+      <w:lvlText w:val=""/>
+      <w:lvlJc w:val="left"/>
+      <w:pPr>
+        <w:tabs>
+          <w:tab w:val="num" w:pos="2880"/>
+        </w:tabs>
+        <w:ind w:left="2880" w:hanging="360"/>
+      </w:pPr>
+      <w:rPr>
+        <w:rFonts w:ascii="Wingdings" w:hAnsi="Wingdings" w:hint="default"/>
+        <w:sz w:val="20"/>
+      </w:rPr>
+    </w:lvl>
+    <w:lvl w:ilvl="4" w:tentative="1">
+      <w:start w:val="1"/>
+      <w:numFmt w:val="bullet"/>
+      <w:lvlText w:val=""/>
+      <w:lvlJc w:val="left"/>
+      <w:pPr>
+        <w:tabs>
+          <w:tab w:val="num" w:pos="3600"/>
+        </w:tabs>
+        <w:ind w:left="3600" w:hanging="360"/>
+      </w:pPr>
+      <w:rPr>
+        <w:rFonts w:ascii="Wingdings" w:hAnsi="Wingdings" w:hint="default"/>
+        <w:sz w:val="20"/>
+      </w:rPr>
+    </w:lvl>
+    <w:lvl w:ilvl="5" w:tentative="1">
+      <w:start w:val="1"/>
+      <w:numFmt w:val="bullet"/>
+      <w:lvlText w:val=""/>
+      <w:lvlJc w:val="left"/>
+      <w:pPr>
+        <w:tabs>
+          <w:tab w:val="num" w:pos="4320"/>
+        </w:tabs>
+        <w:ind w:left="4320" w:hanging="360"/>
+      </w:pPr>
+      <w:rPr>
+        <w:rFonts w:ascii="Wingdings" w:hAnsi="Wingdings" w:hint="default"/>
+        <w:sz w:val="20"/>
+      </w:rPr>
+    </w:lvl>
+    <w:lvl w:ilvl="6" w:tentative="1">
+      <w:start w:val="1"/>
+      <w:numFmt w:val="bullet"/>
+      <w:lvlText w:val=""/>
+      <w:lvlJc w:val="left"/>
+      <w:pPr>
+        <w:tabs>
+          <w:tab w:val="num" w:pos="5040"/>
+        </w:tabs>
+        <w:ind w:left="5040" w:hanging="360"/>
+      </w:pPr>
+      <w:rPr>
+        <w:rFonts w:ascii="Wingdings" w:hAnsi="Wingdings" w:hint="default"/>
+        <w:sz w:val="20"/>
+      </w:rPr>
+    </w:lvl>
+    <w:lvl w:ilvl="7" w:tentative="1">
+      <w:start w:val="1"/>
+      <w:numFmt w:val="bullet"/>
+      <w:lvlText w:val=""/>
+      <w:lvlJc w:val="left"/>
+      <w:pPr>
+        <w:tabs>
+          <w:tab w:val="num" w:pos="5760"/>
+        </w:tabs>
+        <w:ind w:left="5760" w:hanging="360"/>
+      </w:pPr>
+      <w:rPr>
+        <w:rFonts w:ascii="Wingdings" w:hAnsi="Wingdings" w:hint="default"/>
+        <w:sz w:val="20"/>
+      </w:rPr>
+    </w:lvl>
+    <w:lvl w:ilvl="8" w:tentative="1">
+      <w:start w:val="1"/>
+      <w:numFmt w:val="bullet"/>
+      <w:lvlText w:val=""/>
+      <w:lvlJc w:val="left"/>
+      <w:pPr>
+        <w:tabs>
+          <w:tab w:val="num" w:pos="6480"/>
+        </w:tabs>
+        <w:ind w:left="6480" w:hanging="360"/>
+      </w:pPr>
+      <w:rPr>
+        <w:rFonts w:ascii="Wingdings" w:hAnsi="Wingdings" w:hint="default"/>
+        <w:sz w:val="20"/>
+      </w:rPr>
+    </w:lvl>
+  </w:abstractNum>
+  <w:abstractNum w:abstractNumId="19" w15:restartNumberingAfterBreak="0">
     <w:nsid w:val="6B626DB3"/>
     <w:multiLevelType w:val="multilevel"/>
     <w:tmpl w:val="53380260"/>
@@ -4047,7 +5515,7 @@
       </w:rPr>
     </w:lvl>
   </w:abstractNum>
-  <w:abstractNum w:abstractNumId="16" w15:restartNumberingAfterBreak="0">
+  <w:abstractNum w:abstractNumId="20" w15:restartNumberingAfterBreak="0">
     <w:nsid w:val="6F991467"/>
     <w:multiLevelType w:val="multilevel"/>
     <w:tmpl w:val="BA584984"/>
@@ -4196,7 +5664,7 @@
       </w:rPr>
     </w:lvl>
   </w:abstractNum>
-  <w:abstractNum w:abstractNumId="17" w15:restartNumberingAfterBreak="0">
+  <w:abstractNum w:abstractNumId="21" w15:restartNumberingAfterBreak="0">
     <w:nsid w:val="7501785F"/>
     <w:multiLevelType w:val="multilevel"/>
     <w:tmpl w:val="70CCC7CE"/>
@@ -4345,59 +5813,375 @@
       </w:rPr>
     </w:lvl>
   </w:abstractNum>
+  <w:abstractNum w:abstractNumId="22" w15:restartNumberingAfterBreak="0">
+    <w:nsid w:val="76724A06"/>
+    <w:multiLevelType w:val="multilevel"/>
+    <w:tmpl w:val="3B360860"/>
+    <w:lvl w:ilvl="0">
+      <w:start w:val="1"/>
+      <w:numFmt w:val="bullet"/>
+      <w:lvlText w:val=""/>
+      <w:lvlJc w:val="left"/>
+      <w:pPr>
+        <w:tabs>
+          <w:tab w:val="num" w:pos="720"/>
+        </w:tabs>
+        <w:ind w:left="720" w:hanging="360"/>
+      </w:pPr>
+      <w:rPr>
+        <w:rFonts w:ascii="Symbol" w:hAnsi="Symbol" w:hint="default"/>
+        <w:sz w:val="20"/>
+      </w:rPr>
+    </w:lvl>
+    <w:lvl w:ilvl="1" w:tentative="1">
+      <w:start w:val="1"/>
+      <w:numFmt w:val="bullet"/>
+      <w:lvlText w:val="o"/>
+      <w:lvlJc w:val="left"/>
+      <w:pPr>
+        <w:tabs>
+          <w:tab w:val="num" w:pos="1440"/>
+        </w:tabs>
+        <w:ind w:left="1440" w:hanging="360"/>
+      </w:pPr>
+      <w:rPr>
+        <w:rFonts w:ascii="Courier New" w:hAnsi="Courier New" w:hint="default"/>
+        <w:sz w:val="20"/>
+      </w:rPr>
+    </w:lvl>
+    <w:lvl w:ilvl="2" w:tentative="1">
+      <w:start w:val="1"/>
+      <w:numFmt w:val="bullet"/>
+      <w:lvlText w:val=""/>
+      <w:lvlJc w:val="left"/>
+      <w:pPr>
+        <w:tabs>
+          <w:tab w:val="num" w:pos="2160"/>
+        </w:tabs>
+        <w:ind w:left="2160" w:hanging="360"/>
+      </w:pPr>
+      <w:rPr>
+        <w:rFonts w:ascii="Wingdings" w:hAnsi="Wingdings" w:hint="default"/>
+        <w:sz w:val="20"/>
+      </w:rPr>
+    </w:lvl>
+    <w:lvl w:ilvl="3" w:tentative="1">
+      <w:start w:val="1"/>
+      <w:numFmt w:val="bullet"/>
+      <w:lvlText w:val=""/>
+      <w:lvlJc w:val="left"/>
+      <w:pPr>
+        <w:tabs>
+          <w:tab w:val="num" w:pos="2880"/>
+        </w:tabs>
+        <w:ind w:left="2880" w:hanging="360"/>
+      </w:pPr>
+      <w:rPr>
+        <w:rFonts w:ascii="Wingdings" w:hAnsi="Wingdings" w:hint="default"/>
+        <w:sz w:val="20"/>
+      </w:rPr>
+    </w:lvl>
+    <w:lvl w:ilvl="4" w:tentative="1">
+      <w:start w:val="1"/>
+      <w:numFmt w:val="bullet"/>
+      <w:lvlText w:val=""/>
+      <w:lvlJc w:val="left"/>
+      <w:pPr>
+        <w:tabs>
+          <w:tab w:val="num" w:pos="3600"/>
+        </w:tabs>
+        <w:ind w:left="3600" w:hanging="360"/>
+      </w:pPr>
+      <w:rPr>
+        <w:rFonts w:ascii="Wingdings" w:hAnsi="Wingdings" w:hint="default"/>
+        <w:sz w:val="20"/>
+      </w:rPr>
+    </w:lvl>
+    <w:lvl w:ilvl="5" w:tentative="1">
+      <w:start w:val="1"/>
+      <w:numFmt w:val="bullet"/>
+      <w:lvlText w:val=""/>
+      <w:lvlJc w:val="left"/>
+      <w:pPr>
+        <w:tabs>
+          <w:tab w:val="num" w:pos="4320"/>
+        </w:tabs>
+        <w:ind w:left="4320" w:hanging="360"/>
+      </w:pPr>
+      <w:rPr>
+        <w:rFonts w:ascii="Wingdings" w:hAnsi="Wingdings" w:hint="default"/>
+        <w:sz w:val="20"/>
+      </w:rPr>
+    </w:lvl>
+    <w:lvl w:ilvl="6" w:tentative="1">
+      <w:start w:val="1"/>
+      <w:numFmt w:val="bullet"/>
+      <w:lvlText w:val=""/>
+      <w:lvlJc w:val="left"/>
+      <w:pPr>
+        <w:tabs>
+          <w:tab w:val="num" w:pos="5040"/>
+        </w:tabs>
+        <w:ind w:left="5040" w:hanging="360"/>
+      </w:pPr>
+      <w:rPr>
+        <w:rFonts w:ascii="Wingdings" w:hAnsi="Wingdings" w:hint="default"/>
+        <w:sz w:val="20"/>
+      </w:rPr>
+    </w:lvl>
+    <w:lvl w:ilvl="7" w:tentative="1">
+      <w:start w:val="1"/>
+      <w:numFmt w:val="bullet"/>
+      <w:lvlText w:val=""/>
+      <w:lvlJc w:val="left"/>
+      <w:pPr>
+        <w:tabs>
+          <w:tab w:val="num" w:pos="5760"/>
+        </w:tabs>
+        <w:ind w:left="5760" w:hanging="360"/>
+      </w:pPr>
+      <w:rPr>
+        <w:rFonts w:ascii="Wingdings" w:hAnsi="Wingdings" w:hint="default"/>
+        <w:sz w:val="20"/>
+      </w:rPr>
+    </w:lvl>
+    <w:lvl w:ilvl="8" w:tentative="1">
+      <w:start w:val="1"/>
+      <w:numFmt w:val="bullet"/>
+      <w:lvlText w:val=""/>
+      <w:lvlJc w:val="left"/>
+      <w:pPr>
+        <w:tabs>
+          <w:tab w:val="num" w:pos="6480"/>
+        </w:tabs>
+        <w:ind w:left="6480" w:hanging="360"/>
+      </w:pPr>
+      <w:rPr>
+        <w:rFonts w:ascii="Wingdings" w:hAnsi="Wingdings" w:hint="default"/>
+        <w:sz w:val="20"/>
+      </w:rPr>
+    </w:lvl>
+  </w:abstractNum>
+  <w:abstractNum w:abstractNumId="23" w15:restartNumberingAfterBreak="0">
+    <w:nsid w:val="7F0B10D7"/>
+    <w:multiLevelType w:val="multilevel"/>
+    <w:tmpl w:val="783858F8"/>
+    <w:lvl w:ilvl="0">
+      <w:start w:val="1"/>
+      <w:numFmt w:val="bullet"/>
+      <w:lvlText w:val=""/>
+      <w:lvlJc w:val="left"/>
+      <w:pPr>
+        <w:tabs>
+          <w:tab w:val="num" w:pos="720"/>
+        </w:tabs>
+        <w:ind w:left="720" w:hanging="360"/>
+      </w:pPr>
+      <w:rPr>
+        <w:rFonts w:ascii="Symbol" w:hAnsi="Symbol" w:hint="default"/>
+        <w:sz w:val="20"/>
+      </w:rPr>
+    </w:lvl>
+    <w:lvl w:ilvl="1" w:tentative="1">
+      <w:start w:val="1"/>
+      <w:numFmt w:val="bullet"/>
+      <w:lvlText w:val="o"/>
+      <w:lvlJc w:val="left"/>
+      <w:pPr>
+        <w:tabs>
+          <w:tab w:val="num" w:pos="1440"/>
+        </w:tabs>
+        <w:ind w:left="1440" w:hanging="360"/>
+      </w:pPr>
+      <w:rPr>
+        <w:rFonts w:ascii="Courier New" w:hAnsi="Courier New" w:hint="default"/>
+        <w:sz w:val="20"/>
+      </w:rPr>
+    </w:lvl>
+    <w:lvl w:ilvl="2" w:tentative="1">
+      <w:start w:val="1"/>
+      <w:numFmt w:val="bullet"/>
+      <w:lvlText w:val=""/>
+      <w:lvlJc w:val="left"/>
+      <w:pPr>
+        <w:tabs>
+          <w:tab w:val="num" w:pos="2160"/>
+        </w:tabs>
+        <w:ind w:left="2160" w:hanging="360"/>
+      </w:pPr>
+      <w:rPr>
+        <w:rFonts w:ascii="Wingdings" w:hAnsi="Wingdings" w:hint="default"/>
+        <w:sz w:val="20"/>
+      </w:rPr>
+    </w:lvl>
+    <w:lvl w:ilvl="3" w:tentative="1">
+      <w:start w:val="1"/>
+      <w:numFmt w:val="bullet"/>
+      <w:lvlText w:val=""/>
+      <w:lvlJc w:val="left"/>
+      <w:pPr>
+        <w:tabs>
+          <w:tab w:val="num" w:pos="2880"/>
+        </w:tabs>
+        <w:ind w:left="2880" w:hanging="360"/>
+      </w:pPr>
+      <w:rPr>
+        <w:rFonts w:ascii="Wingdings" w:hAnsi="Wingdings" w:hint="default"/>
+        <w:sz w:val="20"/>
+      </w:rPr>
+    </w:lvl>
+    <w:lvl w:ilvl="4" w:tentative="1">
+      <w:start w:val="1"/>
+      <w:numFmt w:val="bullet"/>
+      <w:lvlText w:val=""/>
+      <w:lvlJc w:val="left"/>
+      <w:pPr>
+        <w:tabs>
+          <w:tab w:val="num" w:pos="3600"/>
+        </w:tabs>
+        <w:ind w:left="3600" w:hanging="360"/>
+      </w:pPr>
+      <w:rPr>
+        <w:rFonts w:ascii="Wingdings" w:hAnsi="Wingdings" w:hint="default"/>
+        <w:sz w:val="20"/>
+      </w:rPr>
+    </w:lvl>
+    <w:lvl w:ilvl="5" w:tentative="1">
+      <w:start w:val="1"/>
+      <w:numFmt w:val="bullet"/>
+      <w:lvlText w:val=""/>
+      <w:lvlJc w:val="left"/>
+      <w:pPr>
+        <w:tabs>
+          <w:tab w:val="num" w:pos="4320"/>
+        </w:tabs>
+        <w:ind w:left="4320" w:hanging="360"/>
+      </w:pPr>
+      <w:rPr>
+        <w:rFonts w:ascii="Wingdings" w:hAnsi="Wingdings" w:hint="default"/>
+        <w:sz w:val="20"/>
+      </w:rPr>
+    </w:lvl>
+    <w:lvl w:ilvl="6" w:tentative="1">
+      <w:start w:val="1"/>
+      <w:numFmt w:val="bullet"/>
+      <w:lvlText w:val=""/>
+      <w:lvlJc w:val="left"/>
+      <w:pPr>
+        <w:tabs>
+          <w:tab w:val="num" w:pos="5040"/>
+        </w:tabs>
+        <w:ind w:left="5040" w:hanging="360"/>
+      </w:pPr>
+      <w:rPr>
+        <w:rFonts w:ascii="Wingdings" w:hAnsi="Wingdings" w:hint="default"/>
+        <w:sz w:val="20"/>
+      </w:rPr>
+    </w:lvl>
+    <w:lvl w:ilvl="7" w:tentative="1">
+      <w:start w:val="1"/>
+      <w:numFmt w:val="bullet"/>
+      <w:lvlText w:val=""/>
+      <w:lvlJc w:val="left"/>
+      <w:pPr>
+        <w:tabs>
+          <w:tab w:val="num" w:pos="5760"/>
+        </w:tabs>
+        <w:ind w:left="5760" w:hanging="360"/>
+      </w:pPr>
+      <w:rPr>
+        <w:rFonts w:ascii="Wingdings" w:hAnsi="Wingdings" w:hint="default"/>
+        <w:sz w:val="20"/>
+      </w:rPr>
+    </w:lvl>
+    <w:lvl w:ilvl="8" w:tentative="1">
+      <w:start w:val="1"/>
+      <w:numFmt w:val="bullet"/>
+      <w:lvlText w:val=""/>
+      <w:lvlJc w:val="left"/>
+      <w:pPr>
+        <w:tabs>
+          <w:tab w:val="num" w:pos="6480"/>
+        </w:tabs>
+        <w:ind w:left="6480" w:hanging="360"/>
+      </w:pPr>
+      <w:rPr>
+        <w:rFonts w:ascii="Wingdings" w:hAnsi="Wingdings" w:hint="default"/>
+        <w:sz w:val="20"/>
+      </w:rPr>
+    </w:lvl>
+  </w:abstractNum>
   <w:num w:numId="1">
+    <w:abstractNumId w:val="20"/>
+  </w:num>
+  <w:num w:numId="2">
     <w:abstractNumId w:val="16"/>
   </w:num>
-  <w:num w:numId="2">
-    <w:abstractNumId w:val="13"/>
-  </w:num>
   <w:num w:numId="3">
-    <w:abstractNumId w:val="5"/>
+    <w:abstractNumId w:val="6"/>
   </w:num>
   <w:num w:numId="4">
     <w:abstractNumId w:val="2"/>
   </w:num>
   <w:num w:numId="5">
-    <w:abstractNumId w:val="7"/>
+    <w:abstractNumId w:val="8"/>
   </w:num>
   <w:num w:numId="6">
-    <w:abstractNumId w:val="3"/>
+    <w:abstractNumId w:val="4"/>
   </w:num>
   <w:num w:numId="7">
-    <w:abstractNumId w:val="6"/>
+    <w:abstractNumId w:val="7"/>
   </w:num>
   <w:num w:numId="8">
     <w:abstractNumId w:val="1"/>
   </w:num>
   <w:num w:numId="9">
+    <w:abstractNumId w:val="21"/>
+  </w:num>
+  <w:num w:numId="10">
+    <w:abstractNumId w:val="11"/>
+  </w:num>
+  <w:num w:numId="11">
+    <w:abstractNumId w:val="9"/>
+  </w:num>
+  <w:num w:numId="12">
+    <w:abstractNumId w:val="15"/>
+  </w:num>
+  <w:num w:numId="13">
     <w:abstractNumId w:val="17"/>
   </w:num>
-  <w:num w:numId="10">
-    <w:abstractNumId w:val="9"/>
-  </w:num>
-  <w:num w:numId="11">
-    <w:abstractNumId w:val="8"/>
-  </w:num>
-  <w:num w:numId="12">
-    <w:abstractNumId w:val="12"/>
-  </w:num>
-  <w:num w:numId="13">
-    <w:abstractNumId w:val="14"/>
-  </w:num>
   <w:num w:numId="14">
-    <w:abstractNumId w:val="11"/>
+    <w:abstractNumId w:val="13"/>
   </w:num>
   <w:num w:numId="15">
-    <w:abstractNumId w:val="4"/>
+    <w:abstractNumId w:val="5"/>
   </w:num>
   <w:num w:numId="16">
-    <w:abstractNumId w:val="15"/>
+    <w:abstractNumId w:val="19"/>
   </w:num>
   <w:num w:numId="17">
-    <w:abstractNumId w:val="10"/>
+    <w:abstractNumId w:val="12"/>
   </w:num>
   <w:num w:numId="18">
     <w:abstractNumId w:val="0"/>
+  </w:num>
+  <w:num w:numId="19">
+    <w:abstractNumId w:val="23"/>
+  </w:num>
+  <w:num w:numId="20">
+    <w:abstractNumId w:val="10"/>
+  </w:num>
+  <w:num w:numId="21">
+    <w:abstractNumId w:val="22"/>
+  </w:num>
+  <w:num w:numId="22">
+    <w:abstractNumId w:val="18"/>
+  </w:num>
+  <w:num w:numId="23">
+    <w:abstractNumId w:val="14"/>
+  </w:num>
+  <w:num w:numId="24">
+    <w:abstractNumId w:val="3"/>
   </w:num>
 </w:numbering>
 </file>

</xml_diff>

<commit_message>
Production release: Complete Modules 6–8 (Dashboard, Export, IPC), installer setup, deployment scripts, and full project documentation
</commit_message>
<xml_diff>
--- a/docs/02_Data_Sources.docx
+++ b/docs/02_Data_Sources.docx
@@ -3848,7 +3848,6 @@
       <w:r>
         <w:t xml:space="preserve">Confirmed ingestion metadata persistence through </w:t>
       </w:r>
-      <w:proofErr w:type="spellStart"/>
       <w:r>
         <w:rPr>
           <w:rStyle w:val="HTMLCode"/>
@@ -3856,7 +3855,6 @@
         </w:rPr>
         <w:t>ingested_files</w:t>
       </w:r>
-      <w:proofErr w:type="spellEnd"/>
       <w:r>
         <w:t xml:space="preserve"> table</w:t>
       </w:r>
@@ -3905,11 +3903,9 @@
           <w:numId w:val="32"/>
         </w:numPr>
       </w:pPr>
-      <w:proofErr w:type="spellStart"/>
       <w:r>
         <w:t>ingested_files</w:t>
       </w:r>
-      <w:proofErr w:type="spellEnd"/>
     </w:p>
     <w:p>
       <w:pPr>
@@ -3919,11 +3915,9 @@
           <w:numId w:val="32"/>
         </w:numPr>
       </w:pPr>
-      <w:proofErr w:type="spellStart"/>
       <w:r>
         <w:t>feature_store</w:t>
       </w:r>
-      <w:proofErr w:type="spellEnd"/>
     </w:p>
     <w:p>
       <w:pPr>
@@ -3933,11 +3927,9 @@
           <w:numId w:val="32"/>
         </w:numPr>
       </w:pPr>
-      <w:proofErr w:type="spellStart"/>
       <w:r>
         <w:t>profiling_results</w:t>
       </w:r>
-      <w:proofErr w:type="spellEnd"/>
     </w:p>
     <w:p>
       <w:pPr>
@@ -3984,15 +3976,7 @@
         </w:numPr>
       </w:pPr>
       <w:r>
-        <w:t xml:space="preserve">Verified offline-only </w:t>
-      </w:r>
-      <w:proofErr w:type="spellStart"/>
-      <w:r>
-        <w:t>DuckDB</w:t>
-      </w:r>
-      <w:proofErr w:type="spellEnd"/>
-      <w:r>
-        <w:t xml:space="preserve"> execution without external API dependency</w:t>
+        <w:t>Verified offline-only DuckDB execution without external API dependency</w:t>
       </w:r>
     </w:p>
     <w:p>
@@ -4113,10 +4097,7 @@
         <w:spacing w:before="0" w:beforeAutospacing="0" w:after="0" w:afterAutospacing="0"/>
       </w:pPr>
       <w:r>
-        <w:t>Day 27&amp;28</w:t>
-      </w:r>
-      <w:r>
-        <w:t xml:space="preserve"> Update</w:t>
+        <w:t>Day 27&amp;28 Update</w:t>
       </w:r>
     </w:p>
     <w:p>
@@ -4161,15 +4142,7 @@
         <w:spacing w:before="0" w:beforeAutospacing="0" w:after="0" w:afterAutospacing="0"/>
       </w:pPr>
       <w:r>
-        <w:t xml:space="preserve">Conceptualized data flow design for </w:t>
-      </w:r>
-      <w:proofErr w:type="spellStart"/>
-      <w:r>
-        <w:t>ScanKar</w:t>
-      </w:r>
-      <w:proofErr w:type="spellEnd"/>
-      <w:r>
-        <w:t>:</w:t>
+        <w:t>Conceptualized data flow design for ScanKar:</w:t>
       </w:r>
     </w:p>
     <w:p>
@@ -4233,212 +4206,1166 @@
       <w:pPr>
         <w:pStyle w:val="Heading3"/>
       </w:pPr>
-      <w:bookmarkStart w:id="0" w:name="_GoBack"/>
-      <w:bookmarkEnd w:id="0"/>
-    </w:p>
-    <w:p>
-      <w:pPr>
-        <w:spacing w:before="100" w:beforeAutospacing="1" w:after="100" w:afterAutospacing="1" w:line="240" w:lineRule="auto"/>
+    </w:p>
+    <w:p>
+      <w:pPr>
+        <w:pStyle w:val="Heading3"/>
+        <w:spacing w:before="0" w:beforeAutospacing="0" w:after="0" w:afterAutospacing="0"/>
+      </w:pPr>
+      <w:r>
+        <w:lastRenderedPageBreak/>
+        <w:t>Day 29</w:t>
+      </w:r>
+      <w:r>
+        <w:t xml:space="preserve"> Update</w:t>
+      </w:r>
+    </w:p>
+    <w:p>
+      <w:pPr>
+        <w:pStyle w:val="Heading3"/>
+        <w:spacing w:before="0" w:beforeAutospacing="0" w:after="0" w:afterAutospacing="0"/>
+      </w:pPr>
+    </w:p>
+    <w:p>
+      <w:pPr>
+        <w:pStyle w:val="ListParagraph"/>
+        <w:numPr>
+          <w:ilvl w:val="0"/>
+          <w:numId w:val="42"/>
+        </w:numPr>
+        <w:spacing w:after="0" w:line="240" w:lineRule="auto"/>
         <w:rPr>
           <w:rFonts w:ascii="Times New Roman" w:eastAsia="Times New Roman" w:hAnsi="Times New Roman" w:cs="Times New Roman"/>
           <w:sz w:val="24"/>
           <w:szCs w:val="24"/>
         </w:rPr>
       </w:pPr>
-      <w:proofErr w:type="gramStart"/>
-      <w:r>
-        <w:rPr>
-          <w:rFonts w:ascii="Times New Roman" w:eastAsia="Times New Roman" w:hAnsi="Symbol" w:cs="Times New Roman"/>
-          <w:sz w:val="24"/>
-          <w:szCs w:val="24"/>
-        </w:rPr>
-        <w:lastRenderedPageBreak/>
-        <w:t></w:t>
-      </w:r>
       <w:r>
         <w:rPr>
           <w:rFonts w:ascii="Times New Roman" w:eastAsia="Times New Roman" w:hAnsi="Times New Roman" w:cs="Times New Roman"/>
           <w:sz w:val="24"/>
           <w:szCs w:val="24"/>
         </w:rPr>
-        <w:t xml:space="preserve">  Confirmed</w:t>
-      </w:r>
-      <w:proofErr w:type="gramEnd"/>
-      <w:r>
+        <w:t>Confirmed profiling operates on parquet files generated from ingestion</w:t>
+      </w:r>
+    </w:p>
+    <w:p>
+      <w:pPr>
+        <w:pStyle w:val="ListParagraph"/>
+        <w:numPr>
+          <w:ilvl w:val="0"/>
+          <w:numId w:val="42"/>
+        </w:numPr>
+        <w:spacing w:after="0" w:line="240" w:lineRule="auto"/>
         <w:rPr>
           <w:rFonts w:ascii="Times New Roman" w:eastAsia="Times New Roman" w:hAnsi="Times New Roman" w:cs="Times New Roman"/>
           <w:sz w:val="24"/>
           <w:szCs w:val="24"/>
         </w:rPr>
-        <w:t xml:space="preserve"> profiling operates on parquet files generated from ingestion</w:t>
-      </w:r>
-    </w:p>
-    <w:p>
-      <w:pPr>
-        <w:spacing w:before="100" w:beforeAutospacing="1" w:after="100" w:afterAutospacing="1" w:line="240" w:lineRule="auto"/>
+      </w:pPr>
+      <w:r>
         <w:rPr>
           <w:rFonts w:ascii="Times New Roman" w:eastAsia="Times New Roman" w:hAnsi="Times New Roman" w:cs="Times New Roman"/>
           <w:sz w:val="24"/>
           <w:szCs w:val="24"/>
         </w:rPr>
-      </w:pPr>
-      <w:proofErr w:type="gramStart"/>
-      <w:r>
-        <w:rPr>
-          <w:rFonts w:ascii="Times New Roman" w:eastAsia="Times New Roman" w:hAnsi="Symbol" w:cs="Times New Roman"/>
-          <w:sz w:val="24"/>
-          <w:szCs w:val="24"/>
-        </w:rPr>
-        <w:t></w:t>
-      </w:r>
-      <w:r>
+        <w:t>Validated automatic column classification and statistical profiling</w:t>
+      </w:r>
+    </w:p>
+    <w:p>
+      <w:pPr>
+        <w:pStyle w:val="ListParagraph"/>
+        <w:numPr>
+          <w:ilvl w:val="0"/>
+          <w:numId w:val="42"/>
+        </w:numPr>
+        <w:spacing w:after="0" w:line="240" w:lineRule="auto"/>
         <w:rPr>
           <w:rFonts w:ascii="Times New Roman" w:eastAsia="Times New Roman" w:hAnsi="Times New Roman" w:cs="Times New Roman"/>
           <w:sz w:val="24"/>
           <w:szCs w:val="24"/>
         </w:rPr>
-        <w:t xml:space="preserve">  Validated</w:t>
-      </w:r>
-      <w:proofErr w:type="gramEnd"/>
+      </w:pPr>
       <w:r>
         <w:rPr>
           <w:rFonts w:ascii="Times New Roman" w:eastAsia="Times New Roman" w:hAnsi="Times New Roman" w:cs="Times New Roman"/>
           <w:sz w:val="24"/>
           <w:szCs w:val="24"/>
         </w:rPr>
-        <w:t xml:space="preserve"> automatic column classification and statistical profiling</w:t>
-      </w:r>
-    </w:p>
-    <w:p>
-      <w:pPr>
-        <w:spacing w:before="100" w:beforeAutospacing="1" w:after="100" w:afterAutospacing="1" w:line="240" w:lineRule="auto"/>
+        <w:t>Health scoring system integrated (0–100 scale)</w:t>
+      </w:r>
+    </w:p>
+    <w:p>
+      <w:pPr>
+        <w:pStyle w:val="ListParagraph"/>
+        <w:numPr>
+          <w:ilvl w:val="0"/>
+          <w:numId w:val="42"/>
+        </w:numPr>
+        <w:spacing w:after="0" w:line="240" w:lineRule="auto"/>
         <w:rPr>
           <w:rFonts w:ascii="Times New Roman" w:eastAsia="Times New Roman" w:hAnsi="Times New Roman" w:cs="Times New Roman"/>
           <w:sz w:val="24"/>
           <w:szCs w:val="24"/>
         </w:rPr>
       </w:pPr>
-      <w:proofErr w:type="gramStart"/>
-      <w:r>
-        <w:rPr>
-          <w:rFonts w:ascii="Times New Roman" w:eastAsia="Times New Roman" w:hAnsi="Symbol" w:cs="Times New Roman"/>
-          <w:sz w:val="24"/>
-          <w:szCs w:val="24"/>
-        </w:rPr>
-        <w:t></w:t>
-      </w:r>
       <w:r>
         <w:rPr>
           <w:rFonts w:ascii="Times New Roman" w:eastAsia="Times New Roman" w:hAnsi="Times New Roman" w:cs="Times New Roman"/>
           <w:sz w:val="24"/>
           <w:szCs w:val="24"/>
         </w:rPr>
-        <w:t xml:space="preserve">  Health</w:t>
-      </w:r>
-      <w:proofErr w:type="gramEnd"/>
-      <w:r>
+        <w:t>Synthetic datasets (PLC, SAP, RFID) validated for rule testing</w:t>
+      </w:r>
+    </w:p>
+    <w:p>
+      <w:pPr>
+        <w:pStyle w:val="ListParagraph"/>
+        <w:numPr>
+          <w:ilvl w:val="0"/>
+          <w:numId w:val="42"/>
+        </w:numPr>
+        <w:spacing w:after="0" w:line="240" w:lineRule="auto"/>
         <w:rPr>
           <w:rFonts w:ascii="Times New Roman" w:eastAsia="Times New Roman" w:hAnsi="Times New Roman" w:cs="Times New Roman"/>
           <w:sz w:val="24"/>
           <w:szCs w:val="24"/>
         </w:rPr>
-        <w:t xml:space="preserve"> scoring system integrated (0–100 scale)</w:t>
-      </w:r>
-    </w:p>
-    <w:p>
-      <w:pPr>
-        <w:spacing w:before="100" w:beforeAutospacing="1" w:after="100" w:afterAutospacing="1" w:line="240" w:lineRule="auto"/>
+      </w:pPr>
+      <w:r>
         <w:rPr>
           <w:rFonts w:ascii="Times New Roman" w:eastAsia="Times New Roman" w:hAnsi="Times New Roman" w:cs="Times New Roman"/>
           <w:sz w:val="24"/>
           <w:szCs w:val="24"/>
         </w:rPr>
-      </w:pPr>
-      <w:proofErr w:type="gramStart"/>
-      <w:r>
-        <w:rPr>
-          <w:rFonts w:ascii="Times New Roman" w:eastAsia="Times New Roman" w:hAnsi="Symbol" w:cs="Times New Roman"/>
-          <w:sz w:val="24"/>
-          <w:szCs w:val="24"/>
-        </w:rPr>
-        <w:t></w:t>
-      </w:r>
-      <w:r>
+        <w:t>Confirmed profiling_results table population post ingestion</w:t>
+      </w:r>
+    </w:p>
+    <w:p>
+      <w:pPr>
+        <w:spacing w:after="0" w:line="240" w:lineRule="auto"/>
         <w:rPr>
           <w:rFonts w:ascii="Times New Roman" w:eastAsia="Times New Roman" w:hAnsi="Times New Roman" w:cs="Times New Roman"/>
           <w:sz w:val="24"/>
           <w:szCs w:val="24"/>
         </w:rPr>
-        <w:t xml:space="preserve">  Synthetic</w:t>
-      </w:r>
-      <w:proofErr w:type="gramEnd"/>
-      <w:r>
+      </w:pPr>
+    </w:p>
+    <w:p>
+      <w:pPr>
+        <w:pStyle w:val="Heading3"/>
+        <w:spacing w:before="0" w:beforeAutospacing="0" w:after="0" w:afterAutospacing="0"/>
+      </w:pPr>
+      <w:r>
+        <w:t xml:space="preserve">Day </w:t>
+      </w:r>
+      <w:r>
+        <w:t>32</w:t>
+      </w:r>
+      <w:r>
+        <w:t xml:space="preserve"> Update</w:t>
+      </w:r>
+    </w:p>
+    <w:p>
+      <w:pPr>
+        <w:pStyle w:val="Heading3"/>
+        <w:spacing w:before="0" w:beforeAutospacing="0" w:after="0" w:afterAutospacing="0"/>
+      </w:pPr>
+    </w:p>
+    <w:p>
+      <w:pPr>
+        <w:spacing w:after="0" w:line="240" w:lineRule="auto"/>
+        <w:outlineLvl w:val="2"/>
+        <w:rPr>
+          <w:rFonts w:ascii="Times New Roman" w:eastAsia="Times New Roman" w:hAnsi="Times New Roman" w:cs="Times New Roman"/>
+          <w:b/>
+          <w:bCs/>
+          <w:sz w:val="27"/>
+          <w:szCs w:val="27"/>
+        </w:rPr>
+      </w:pPr>
+      <w:r>
+        <w:rPr>
+          <w:rFonts w:ascii="Times New Roman" w:eastAsia="Times New Roman" w:hAnsi="Times New Roman" w:cs="Times New Roman"/>
+          <w:b/>
+          <w:bCs/>
+          <w:sz w:val="27"/>
+          <w:szCs w:val="27"/>
+        </w:rPr>
+        <w:t>Purpose</w:t>
+      </w:r>
+    </w:p>
+    <w:p>
+      <w:pPr>
+        <w:spacing w:after="0" w:line="240" w:lineRule="auto"/>
         <w:rPr>
           <w:rFonts w:ascii="Times New Roman" w:eastAsia="Times New Roman" w:hAnsi="Times New Roman" w:cs="Times New Roman"/>
           <w:sz w:val="24"/>
           <w:szCs w:val="24"/>
         </w:rPr>
-        <w:t xml:space="preserve"> datasets (PLC, SAP, RFID) validated for rule testing</w:t>
-      </w:r>
-    </w:p>
-    <w:p>
-      <w:pPr>
-        <w:spacing w:before="100" w:beforeAutospacing="1" w:after="100" w:afterAutospacing="1" w:line="240" w:lineRule="auto"/>
+      </w:pPr>
+      <w:r>
         <w:rPr>
           <w:rFonts w:ascii="Times New Roman" w:eastAsia="Times New Roman" w:hAnsi="Times New Roman" w:cs="Times New Roman"/>
           <w:sz w:val="24"/>
           <w:szCs w:val="24"/>
         </w:rPr>
-      </w:pPr>
-      <w:proofErr w:type="gramStart"/>
-      <w:r>
-        <w:rPr>
-          <w:rFonts w:ascii="Times New Roman" w:eastAsia="Times New Roman" w:hAnsi="Symbol" w:cs="Times New Roman"/>
-          <w:sz w:val="24"/>
-          <w:szCs w:val="24"/>
-        </w:rPr>
-        <w:t></w:t>
-      </w:r>
-      <w:r>
+        <w:t>To document all industrial data sources used in the Offline Industrial Intelligence System and their role in the analytics pipeline.</w:t>
+      </w:r>
+    </w:p>
+    <w:p>
+      <w:pPr>
+        <w:spacing w:after="0" w:line="240" w:lineRule="auto"/>
         <w:rPr>
           <w:rFonts w:ascii="Times New Roman" w:eastAsia="Times New Roman" w:hAnsi="Times New Roman" w:cs="Times New Roman"/>
           <w:sz w:val="24"/>
           <w:szCs w:val="24"/>
         </w:rPr>
-        <w:t xml:space="preserve">  Confirmed</w:t>
-      </w:r>
-      <w:proofErr w:type="gramEnd"/>
-      <w:r>
+      </w:pPr>
+    </w:p>
+    <w:p>
+      <w:pPr>
+        <w:spacing w:after="0" w:line="240" w:lineRule="auto"/>
+        <w:outlineLvl w:val="2"/>
+        <w:rPr>
+          <w:rFonts w:ascii="Times New Roman" w:eastAsia="Times New Roman" w:hAnsi="Times New Roman" w:cs="Times New Roman"/>
+          <w:b/>
+          <w:bCs/>
+          <w:sz w:val="27"/>
+          <w:szCs w:val="27"/>
+        </w:rPr>
+      </w:pPr>
+      <w:r>
+        <w:rPr>
+          <w:rFonts w:ascii="Times New Roman" w:eastAsia="Times New Roman" w:hAnsi="Times New Roman" w:cs="Times New Roman"/>
+          <w:b/>
+          <w:bCs/>
+          <w:sz w:val="27"/>
+          <w:szCs w:val="27"/>
+        </w:rPr>
+        <w:t>Data Owner</w:t>
+      </w:r>
+    </w:p>
+    <w:p>
+      <w:pPr>
+        <w:spacing w:after="0" w:line="240" w:lineRule="auto"/>
         <w:rPr>
           <w:rFonts w:ascii="Times New Roman" w:eastAsia="Times New Roman" w:hAnsi="Times New Roman" w:cs="Times New Roman"/>
           <w:sz w:val="24"/>
           <w:szCs w:val="24"/>
         </w:rPr>
-        <w:t xml:space="preserve"> </w:t>
-      </w:r>
-      <w:proofErr w:type="spellStart"/>
+      </w:pPr>
       <w:r>
         <w:rPr>
           <w:rFonts w:ascii="Times New Roman" w:eastAsia="Times New Roman" w:hAnsi="Times New Roman" w:cs="Times New Roman"/>
           <w:sz w:val="24"/>
           <w:szCs w:val="24"/>
         </w:rPr>
-        <w:t>profiling_results</w:t>
-      </w:r>
-      <w:proofErr w:type="spellEnd"/>
-      <w:r>
+        <w:t>Maintenance Department (Designated Engineer)</w:t>
+      </w:r>
+    </w:p>
+    <w:p>
+      <w:pPr>
+        <w:spacing w:after="0" w:line="240" w:lineRule="auto"/>
         <w:rPr>
           <w:rFonts w:ascii="Times New Roman" w:eastAsia="Times New Roman" w:hAnsi="Times New Roman" w:cs="Times New Roman"/>
           <w:sz w:val="24"/>
           <w:szCs w:val="24"/>
         </w:rPr>
-        <w:t xml:space="preserve"> table population post ingestion</w:t>
+      </w:pPr>
+    </w:p>
+    <w:p>
+      <w:pPr>
+        <w:spacing w:after="0" w:line="240" w:lineRule="auto"/>
+        <w:outlineLvl w:val="2"/>
+        <w:rPr>
+          <w:rFonts w:ascii="Times New Roman" w:eastAsia="Times New Roman" w:hAnsi="Times New Roman" w:cs="Times New Roman"/>
+          <w:b/>
+          <w:bCs/>
+          <w:sz w:val="27"/>
+          <w:szCs w:val="27"/>
+        </w:rPr>
+      </w:pPr>
+      <w:r>
+        <w:rPr>
+          <w:rFonts w:ascii="Times New Roman" w:eastAsia="Times New Roman" w:hAnsi="Times New Roman" w:cs="Times New Roman"/>
+          <w:b/>
+          <w:bCs/>
+          <w:sz w:val="27"/>
+          <w:szCs w:val="27"/>
+        </w:rPr>
+        <w:t>Identified Data Sources</w:t>
+      </w:r>
+    </w:p>
+    <w:tbl>
+      <w:tblPr>
+        <w:tblW w:w="0" w:type="auto"/>
+        <w:tblCellSpacing w:w="15" w:type="dxa"/>
+        <w:tblCellMar>
+          <w:top w:w="15" w:type="dxa"/>
+          <w:left w:w="15" w:type="dxa"/>
+          <w:bottom w:w="15" w:type="dxa"/>
+          <w:right w:w="15" w:type="dxa"/>
+        </w:tblCellMar>
+        <w:tblLook w:val="04A0" w:firstRow="1" w:lastRow="0" w:firstColumn="1" w:lastColumn="0" w:noHBand="0" w:noVBand="1"/>
+      </w:tblPr>
+      <w:tblGrid>
+        <w:gridCol w:w="1596"/>
+        <w:gridCol w:w="1288"/>
+        <w:gridCol w:w="2042"/>
+      </w:tblGrid>
+      <w:tr>
+        <w:trPr>
+          <w:tblHeader/>
+          <w:tblCellSpacing w:w="15" w:type="dxa"/>
+        </w:trPr>
+        <w:tc>
+          <w:tcPr>
+            <w:tcW w:w="0" w:type="auto"/>
+            <w:vAlign w:val="center"/>
+            <w:hideMark/>
+          </w:tcPr>
+          <w:p>
+            <w:pPr>
+              <w:spacing w:after="0" w:line="240" w:lineRule="auto"/>
+              <w:jc w:val="center"/>
+              <w:rPr>
+                <w:rFonts w:ascii="Times New Roman" w:eastAsia="Times New Roman" w:hAnsi="Times New Roman" w:cs="Times New Roman"/>
+                <w:b/>
+                <w:bCs/>
+                <w:sz w:val="24"/>
+                <w:szCs w:val="24"/>
+              </w:rPr>
+            </w:pPr>
+            <w:r>
+              <w:rPr>
+                <w:rFonts w:ascii="Times New Roman" w:eastAsia="Times New Roman" w:hAnsi="Times New Roman" w:cs="Times New Roman"/>
+                <w:b/>
+                <w:bCs/>
+                <w:sz w:val="24"/>
+                <w:szCs w:val="24"/>
+              </w:rPr>
+              <w:t>Data Source</w:t>
+            </w:r>
+          </w:p>
+        </w:tc>
+        <w:tc>
+          <w:tcPr>
+            <w:tcW w:w="0" w:type="auto"/>
+            <w:vAlign w:val="center"/>
+            <w:hideMark/>
+          </w:tcPr>
+          <w:p>
+            <w:pPr>
+              <w:spacing w:after="0" w:line="240" w:lineRule="auto"/>
+              <w:jc w:val="center"/>
+              <w:rPr>
+                <w:rFonts w:ascii="Times New Roman" w:eastAsia="Times New Roman" w:hAnsi="Times New Roman" w:cs="Times New Roman"/>
+                <w:b/>
+                <w:bCs/>
+                <w:sz w:val="24"/>
+                <w:szCs w:val="24"/>
+              </w:rPr>
+            </w:pPr>
+            <w:r>
+              <w:rPr>
+                <w:rFonts w:ascii="Times New Roman" w:eastAsia="Times New Roman" w:hAnsi="Times New Roman" w:cs="Times New Roman"/>
+                <w:b/>
+                <w:bCs/>
+                <w:sz w:val="24"/>
+                <w:szCs w:val="24"/>
+              </w:rPr>
+              <w:t>Format</w:t>
+            </w:r>
+          </w:p>
+        </w:tc>
+        <w:tc>
+          <w:tcPr>
+            <w:tcW w:w="0" w:type="auto"/>
+            <w:vAlign w:val="center"/>
+            <w:hideMark/>
+          </w:tcPr>
+          <w:p>
+            <w:pPr>
+              <w:spacing w:after="0" w:line="240" w:lineRule="auto"/>
+              <w:jc w:val="center"/>
+              <w:rPr>
+                <w:rFonts w:ascii="Times New Roman" w:eastAsia="Times New Roman" w:hAnsi="Times New Roman" w:cs="Times New Roman"/>
+                <w:b/>
+                <w:bCs/>
+                <w:sz w:val="24"/>
+                <w:szCs w:val="24"/>
+              </w:rPr>
+            </w:pPr>
+            <w:r>
+              <w:rPr>
+                <w:rFonts w:ascii="Times New Roman" w:eastAsia="Times New Roman" w:hAnsi="Times New Roman" w:cs="Times New Roman"/>
+                <w:b/>
+                <w:bCs/>
+                <w:sz w:val="24"/>
+                <w:szCs w:val="24"/>
+              </w:rPr>
+              <w:t>Usage</w:t>
+            </w:r>
+          </w:p>
+        </w:tc>
+      </w:tr>
+      <w:tr>
+        <w:trPr>
+          <w:tblCellSpacing w:w="15" w:type="dxa"/>
+        </w:trPr>
+        <w:tc>
+          <w:tcPr>
+            <w:tcW w:w="0" w:type="auto"/>
+            <w:vAlign w:val="center"/>
+            <w:hideMark/>
+          </w:tcPr>
+          <w:p>
+            <w:pPr>
+              <w:spacing w:after="0" w:line="240" w:lineRule="auto"/>
+              <w:rPr>
+                <w:rFonts w:ascii="Times New Roman" w:eastAsia="Times New Roman" w:hAnsi="Times New Roman" w:cs="Times New Roman"/>
+                <w:sz w:val="24"/>
+                <w:szCs w:val="24"/>
+              </w:rPr>
+            </w:pPr>
+            <w:r>
+              <w:rPr>
+                <w:rFonts w:ascii="Times New Roman" w:eastAsia="Times New Roman" w:hAnsi="Times New Roman" w:cs="Times New Roman"/>
+                <w:sz w:val="24"/>
+                <w:szCs w:val="24"/>
+              </w:rPr>
+              <w:t>SAP IW29</w:t>
+            </w:r>
+          </w:p>
+        </w:tc>
+        <w:tc>
+          <w:tcPr>
+            <w:tcW w:w="0" w:type="auto"/>
+            <w:vAlign w:val="center"/>
+            <w:hideMark/>
+          </w:tcPr>
+          <w:p>
+            <w:pPr>
+              <w:spacing w:after="0" w:line="240" w:lineRule="auto"/>
+              <w:rPr>
+                <w:rFonts w:ascii="Times New Roman" w:eastAsia="Times New Roman" w:hAnsi="Times New Roman" w:cs="Times New Roman"/>
+                <w:sz w:val="24"/>
+                <w:szCs w:val="24"/>
+              </w:rPr>
+            </w:pPr>
+            <w:r>
+              <w:rPr>
+                <w:rFonts w:ascii="Times New Roman" w:eastAsia="Times New Roman" w:hAnsi="Times New Roman" w:cs="Times New Roman"/>
+                <w:sz w:val="24"/>
+                <w:szCs w:val="24"/>
+              </w:rPr>
+              <w:t>CSV / Excel</w:t>
+            </w:r>
+          </w:p>
+        </w:tc>
+        <w:tc>
+          <w:tcPr>
+            <w:tcW w:w="0" w:type="auto"/>
+            <w:vAlign w:val="center"/>
+            <w:hideMark/>
+          </w:tcPr>
+          <w:p>
+            <w:pPr>
+              <w:spacing w:after="0" w:line="240" w:lineRule="auto"/>
+              <w:rPr>
+                <w:rFonts w:ascii="Times New Roman" w:eastAsia="Times New Roman" w:hAnsi="Times New Roman" w:cs="Times New Roman"/>
+                <w:sz w:val="24"/>
+                <w:szCs w:val="24"/>
+              </w:rPr>
+            </w:pPr>
+            <w:r>
+              <w:rPr>
+                <w:rFonts w:ascii="Times New Roman" w:eastAsia="Times New Roman" w:hAnsi="Times New Roman" w:cs="Times New Roman"/>
+                <w:sz w:val="24"/>
+                <w:szCs w:val="24"/>
+              </w:rPr>
+              <w:t>Maintenance history</w:t>
+            </w:r>
+          </w:p>
+        </w:tc>
+      </w:tr>
+      <w:tr>
+        <w:trPr>
+          <w:tblCellSpacing w:w="15" w:type="dxa"/>
+        </w:trPr>
+        <w:tc>
+          <w:tcPr>
+            <w:tcW w:w="0" w:type="auto"/>
+            <w:vAlign w:val="center"/>
+            <w:hideMark/>
+          </w:tcPr>
+          <w:p>
+            <w:pPr>
+              <w:spacing w:after="0" w:line="240" w:lineRule="auto"/>
+              <w:rPr>
+                <w:rFonts w:ascii="Times New Roman" w:eastAsia="Times New Roman" w:hAnsi="Times New Roman" w:cs="Times New Roman"/>
+                <w:sz w:val="24"/>
+                <w:szCs w:val="24"/>
+              </w:rPr>
+            </w:pPr>
+            <w:r>
+              <w:rPr>
+                <w:rFonts w:ascii="Times New Roman" w:eastAsia="Times New Roman" w:hAnsi="Times New Roman" w:cs="Times New Roman"/>
+                <w:sz w:val="24"/>
+                <w:szCs w:val="24"/>
+              </w:rPr>
+              <w:t>RFID Logs</w:t>
+            </w:r>
+          </w:p>
+        </w:tc>
+        <w:tc>
+          <w:tcPr>
+            <w:tcW w:w="0" w:type="auto"/>
+            <w:vAlign w:val="center"/>
+            <w:hideMark/>
+          </w:tcPr>
+          <w:p>
+            <w:pPr>
+              <w:spacing w:after="0" w:line="240" w:lineRule="auto"/>
+              <w:rPr>
+                <w:rFonts w:ascii="Times New Roman" w:eastAsia="Times New Roman" w:hAnsi="Times New Roman" w:cs="Times New Roman"/>
+                <w:sz w:val="24"/>
+                <w:szCs w:val="24"/>
+              </w:rPr>
+            </w:pPr>
+            <w:r>
+              <w:rPr>
+                <w:rFonts w:ascii="Times New Roman" w:eastAsia="Times New Roman" w:hAnsi="Times New Roman" w:cs="Times New Roman"/>
+                <w:sz w:val="24"/>
+                <w:szCs w:val="24"/>
+              </w:rPr>
+              <w:t>CSV / JSON</w:t>
+            </w:r>
+          </w:p>
+        </w:tc>
+        <w:tc>
+          <w:tcPr>
+            <w:tcW w:w="0" w:type="auto"/>
+            <w:vAlign w:val="center"/>
+            <w:hideMark/>
+          </w:tcPr>
+          <w:p>
+            <w:pPr>
+              <w:spacing w:after="0" w:line="240" w:lineRule="auto"/>
+              <w:rPr>
+                <w:rFonts w:ascii="Times New Roman" w:eastAsia="Times New Roman" w:hAnsi="Times New Roman" w:cs="Times New Roman"/>
+                <w:sz w:val="24"/>
+                <w:szCs w:val="24"/>
+              </w:rPr>
+            </w:pPr>
+            <w:r>
+              <w:rPr>
+                <w:rFonts w:ascii="Times New Roman" w:eastAsia="Times New Roman" w:hAnsi="Times New Roman" w:cs="Times New Roman"/>
+                <w:sz w:val="24"/>
+                <w:szCs w:val="24"/>
+              </w:rPr>
+              <w:t>Movement &amp; events</w:t>
+            </w:r>
+          </w:p>
+        </w:tc>
+      </w:tr>
+      <w:tr>
+        <w:trPr>
+          <w:tblCellSpacing w:w="15" w:type="dxa"/>
+        </w:trPr>
+        <w:tc>
+          <w:tcPr>
+            <w:tcW w:w="0" w:type="auto"/>
+            <w:vAlign w:val="center"/>
+            <w:hideMark/>
+          </w:tcPr>
+          <w:p>
+            <w:pPr>
+              <w:spacing w:after="0" w:line="240" w:lineRule="auto"/>
+              <w:rPr>
+                <w:rFonts w:ascii="Times New Roman" w:eastAsia="Times New Roman" w:hAnsi="Times New Roman" w:cs="Times New Roman"/>
+                <w:sz w:val="24"/>
+                <w:szCs w:val="24"/>
+              </w:rPr>
+            </w:pPr>
+            <w:r>
+              <w:rPr>
+                <w:rFonts w:ascii="Times New Roman" w:eastAsia="Times New Roman" w:hAnsi="Times New Roman" w:cs="Times New Roman"/>
+                <w:sz w:val="24"/>
+                <w:szCs w:val="24"/>
+              </w:rPr>
+              <w:t>PLC / OPC-UA</w:t>
+            </w:r>
+          </w:p>
+        </w:tc>
+        <w:tc>
+          <w:tcPr>
+            <w:tcW w:w="0" w:type="auto"/>
+            <w:vAlign w:val="center"/>
+            <w:hideMark/>
+          </w:tcPr>
+          <w:p>
+            <w:pPr>
+              <w:spacing w:after="0" w:line="240" w:lineRule="auto"/>
+              <w:rPr>
+                <w:rFonts w:ascii="Times New Roman" w:eastAsia="Times New Roman" w:hAnsi="Times New Roman" w:cs="Times New Roman"/>
+                <w:sz w:val="24"/>
+                <w:szCs w:val="24"/>
+              </w:rPr>
+            </w:pPr>
+            <w:r>
+              <w:rPr>
+                <w:rFonts w:ascii="Times New Roman" w:eastAsia="Times New Roman" w:hAnsi="Times New Roman" w:cs="Times New Roman"/>
+                <w:sz w:val="24"/>
+                <w:szCs w:val="24"/>
+              </w:rPr>
+              <w:t>Logs / CSV</w:t>
+            </w:r>
+          </w:p>
+        </w:tc>
+        <w:tc>
+          <w:tcPr>
+            <w:tcW w:w="0" w:type="auto"/>
+            <w:vAlign w:val="center"/>
+            <w:hideMark/>
+          </w:tcPr>
+          <w:p>
+            <w:pPr>
+              <w:spacing w:after="0" w:line="240" w:lineRule="auto"/>
+              <w:rPr>
+                <w:rFonts w:ascii="Times New Roman" w:eastAsia="Times New Roman" w:hAnsi="Times New Roman" w:cs="Times New Roman"/>
+                <w:sz w:val="24"/>
+                <w:szCs w:val="24"/>
+              </w:rPr>
+            </w:pPr>
+            <w:r>
+              <w:rPr>
+                <w:rFonts w:ascii="Times New Roman" w:eastAsia="Times New Roman" w:hAnsi="Times New Roman" w:cs="Times New Roman"/>
+                <w:sz w:val="24"/>
+                <w:szCs w:val="24"/>
+              </w:rPr>
+              <w:t>Machine signals</w:t>
+            </w:r>
+          </w:p>
+        </w:tc>
+      </w:tr>
+      <w:tr>
+        <w:trPr>
+          <w:tblCellSpacing w:w="15" w:type="dxa"/>
+        </w:trPr>
+        <w:tc>
+          <w:tcPr>
+            <w:tcW w:w="0" w:type="auto"/>
+            <w:vAlign w:val="center"/>
+            <w:hideMark/>
+          </w:tcPr>
+          <w:p>
+            <w:pPr>
+              <w:spacing w:after="0" w:line="240" w:lineRule="auto"/>
+              <w:rPr>
+                <w:rFonts w:ascii="Times New Roman" w:eastAsia="Times New Roman" w:hAnsi="Times New Roman" w:cs="Times New Roman"/>
+                <w:sz w:val="24"/>
+                <w:szCs w:val="24"/>
+              </w:rPr>
+            </w:pPr>
+            <w:r>
+              <w:rPr>
+                <w:rFonts w:ascii="Times New Roman" w:eastAsia="Times New Roman" w:hAnsi="Times New Roman" w:cs="Times New Roman"/>
+                <w:sz w:val="24"/>
+                <w:szCs w:val="24"/>
+              </w:rPr>
+              <w:t>Excel Reports</w:t>
+            </w:r>
+          </w:p>
+        </w:tc>
+        <w:tc>
+          <w:tcPr>
+            <w:tcW w:w="0" w:type="auto"/>
+            <w:vAlign w:val="center"/>
+            <w:hideMark/>
+          </w:tcPr>
+          <w:p>
+            <w:pPr>
+              <w:spacing w:after="0" w:line="240" w:lineRule="auto"/>
+              <w:rPr>
+                <w:rFonts w:ascii="Times New Roman" w:eastAsia="Times New Roman" w:hAnsi="Times New Roman" w:cs="Times New Roman"/>
+                <w:sz w:val="24"/>
+                <w:szCs w:val="24"/>
+              </w:rPr>
+            </w:pPr>
+            <w:r>
+              <w:rPr>
+                <w:rFonts w:ascii="Times New Roman" w:eastAsia="Times New Roman" w:hAnsi="Times New Roman" w:cs="Times New Roman"/>
+                <w:sz w:val="24"/>
+                <w:szCs w:val="24"/>
+              </w:rPr>
+              <w:t>Excel</w:t>
+            </w:r>
+          </w:p>
+        </w:tc>
+        <w:tc>
+          <w:tcPr>
+            <w:tcW w:w="0" w:type="auto"/>
+            <w:vAlign w:val="center"/>
+            <w:hideMark/>
+          </w:tcPr>
+          <w:p>
+            <w:pPr>
+              <w:spacing w:after="0" w:line="240" w:lineRule="auto"/>
+              <w:rPr>
+                <w:rFonts w:ascii="Times New Roman" w:eastAsia="Times New Roman" w:hAnsi="Times New Roman" w:cs="Times New Roman"/>
+                <w:sz w:val="24"/>
+                <w:szCs w:val="24"/>
+              </w:rPr>
+            </w:pPr>
+            <w:r>
+              <w:rPr>
+                <w:rFonts w:ascii="Times New Roman" w:eastAsia="Times New Roman" w:hAnsi="Times New Roman" w:cs="Times New Roman"/>
+                <w:sz w:val="24"/>
+                <w:szCs w:val="24"/>
+              </w:rPr>
+              <w:t>KPIs &amp; manual data</w:t>
+            </w:r>
+          </w:p>
+        </w:tc>
+      </w:tr>
+      <w:tr>
+        <w:trPr>
+          <w:tblCellSpacing w:w="15" w:type="dxa"/>
+        </w:trPr>
+        <w:tc>
+          <w:tcPr>
+            <w:tcW w:w="0" w:type="auto"/>
+            <w:vAlign w:val="center"/>
+            <w:hideMark/>
+          </w:tcPr>
+          <w:p>
+            <w:pPr>
+              <w:spacing w:after="0" w:line="240" w:lineRule="auto"/>
+              <w:rPr>
+                <w:rFonts w:ascii="Times New Roman" w:eastAsia="Times New Roman" w:hAnsi="Times New Roman" w:cs="Times New Roman"/>
+                <w:sz w:val="24"/>
+                <w:szCs w:val="24"/>
+              </w:rPr>
+            </w:pPr>
+            <w:r>
+              <w:rPr>
+                <w:rFonts w:ascii="Times New Roman" w:eastAsia="Times New Roman" w:hAnsi="Times New Roman" w:cs="Times New Roman"/>
+                <w:sz w:val="24"/>
+                <w:szCs w:val="24"/>
+              </w:rPr>
+              <w:t>Energy Data</w:t>
+            </w:r>
+          </w:p>
+        </w:tc>
+        <w:tc>
+          <w:tcPr>
+            <w:tcW w:w="0" w:type="auto"/>
+            <w:vAlign w:val="center"/>
+            <w:hideMark/>
+          </w:tcPr>
+          <w:p>
+            <w:pPr>
+              <w:spacing w:after="0" w:line="240" w:lineRule="auto"/>
+              <w:rPr>
+                <w:rFonts w:ascii="Times New Roman" w:eastAsia="Times New Roman" w:hAnsi="Times New Roman" w:cs="Times New Roman"/>
+                <w:sz w:val="24"/>
+                <w:szCs w:val="24"/>
+              </w:rPr>
+            </w:pPr>
+            <w:r>
+              <w:rPr>
+                <w:rFonts w:ascii="Times New Roman" w:eastAsia="Times New Roman" w:hAnsi="Times New Roman" w:cs="Times New Roman"/>
+                <w:sz w:val="24"/>
+                <w:szCs w:val="24"/>
+              </w:rPr>
+              <w:t>Excel</w:t>
+            </w:r>
+          </w:p>
+        </w:tc>
+        <w:tc>
+          <w:tcPr>
+            <w:tcW w:w="0" w:type="auto"/>
+            <w:vAlign w:val="center"/>
+            <w:hideMark/>
+          </w:tcPr>
+          <w:p>
+            <w:pPr>
+              <w:spacing w:after="0" w:line="240" w:lineRule="auto"/>
+              <w:rPr>
+                <w:rFonts w:ascii="Times New Roman" w:eastAsia="Times New Roman" w:hAnsi="Times New Roman" w:cs="Times New Roman"/>
+                <w:sz w:val="24"/>
+                <w:szCs w:val="24"/>
+              </w:rPr>
+            </w:pPr>
+            <w:r>
+              <w:rPr>
+                <w:rFonts w:ascii="Times New Roman" w:eastAsia="Times New Roman" w:hAnsi="Times New Roman" w:cs="Times New Roman"/>
+                <w:sz w:val="24"/>
+                <w:szCs w:val="24"/>
+              </w:rPr>
+              <w:t>Power cost analysis</w:t>
+            </w:r>
+          </w:p>
+        </w:tc>
+      </w:tr>
+    </w:tbl>
+    <w:p>
+      <w:pPr>
+        <w:spacing w:after="0" w:line="240" w:lineRule="auto"/>
+        <w:rPr>
+          <w:rFonts w:ascii="Times New Roman" w:eastAsia="Times New Roman" w:hAnsi="Times New Roman" w:cs="Times New Roman"/>
+          <w:sz w:val="24"/>
+          <w:szCs w:val="24"/>
+        </w:rPr>
+      </w:pPr>
+    </w:p>
+    <w:p>
+      <w:pPr>
+        <w:spacing w:after="0" w:line="240" w:lineRule="auto"/>
+        <w:outlineLvl w:val="2"/>
+        <w:rPr>
+          <w:rFonts w:ascii="Times New Roman" w:eastAsia="Times New Roman" w:hAnsi="Times New Roman" w:cs="Times New Roman"/>
+          <w:b/>
+          <w:bCs/>
+          <w:sz w:val="27"/>
+          <w:szCs w:val="27"/>
+        </w:rPr>
+      </w:pPr>
+      <w:r>
+        <w:rPr>
+          <w:rFonts w:ascii="Times New Roman" w:eastAsia="Times New Roman" w:hAnsi="Times New Roman" w:cs="Times New Roman"/>
+          <w:b/>
+          <w:bCs/>
+          <w:sz w:val="27"/>
+          <w:szCs w:val="27"/>
+        </w:rPr>
+        <w:t>Day 32 Update</w:t>
+      </w:r>
+    </w:p>
+    <w:p>
+      <w:pPr>
+        <w:numPr>
+          <w:ilvl w:val="0"/>
+          <w:numId w:val="40"/>
+        </w:numPr>
+        <w:spacing w:after="0" w:line="240" w:lineRule="auto"/>
+        <w:rPr>
+          <w:rFonts w:ascii="Times New Roman" w:eastAsia="Times New Roman" w:hAnsi="Times New Roman" w:cs="Times New Roman"/>
+          <w:sz w:val="24"/>
+          <w:szCs w:val="24"/>
+        </w:rPr>
+      </w:pPr>
+      <w:r>
+        <w:rPr>
+          <w:rFonts w:ascii="Times New Roman" w:eastAsia="Times New Roman" w:hAnsi="Times New Roman" w:cs="Times New Roman"/>
+          <w:sz w:val="24"/>
+          <w:szCs w:val="24"/>
+        </w:rPr>
+        <w:t>No new data sources introduced</w:t>
+      </w:r>
+    </w:p>
+    <w:p>
+      <w:pPr>
+        <w:numPr>
+          <w:ilvl w:val="0"/>
+          <w:numId w:val="40"/>
+        </w:numPr>
+        <w:spacing w:after="0" w:line="240" w:lineRule="auto"/>
+        <w:rPr>
+          <w:rFonts w:ascii="Times New Roman" w:eastAsia="Times New Roman" w:hAnsi="Times New Roman" w:cs="Times New Roman"/>
+          <w:sz w:val="24"/>
+          <w:szCs w:val="24"/>
+        </w:rPr>
+      </w:pPr>
+      <w:r>
+        <w:rPr>
+          <w:rFonts w:ascii="Times New Roman" w:eastAsia="Times New Roman" w:hAnsi="Times New Roman" w:cs="Times New Roman"/>
+          <w:sz w:val="24"/>
+          <w:szCs w:val="24"/>
+        </w:rPr>
+        <w:t>Existing datasets fully validated in pipeline execution</w:t>
+      </w:r>
+    </w:p>
+    <w:p>
+      <w:pPr>
+        <w:numPr>
+          <w:ilvl w:val="0"/>
+          <w:numId w:val="40"/>
+        </w:numPr>
+        <w:spacing w:after="0" w:line="240" w:lineRule="auto"/>
+        <w:rPr>
+          <w:rFonts w:ascii="Times New Roman" w:eastAsia="Times New Roman" w:hAnsi="Times New Roman" w:cs="Times New Roman"/>
+          <w:sz w:val="24"/>
+          <w:szCs w:val="24"/>
+        </w:rPr>
+      </w:pPr>
+      <w:r>
+        <w:rPr>
+          <w:rFonts w:ascii="Times New Roman" w:eastAsia="Times New Roman" w:hAnsi="Times New Roman" w:cs="Times New Roman"/>
+          <w:sz w:val="24"/>
+          <w:szCs w:val="24"/>
+        </w:rPr>
+        <w:t>Dataset used for validation:</w:t>
+      </w:r>
+    </w:p>
+    <w:p>
+      <w:pPr>
+        <w:numPr>
+          <w:ilvl w:val="1"/>
+          <w:numId w:val="40"/>
+        </w:numPr>
+        <w:spacing w:after="0" w:line="240" w:lineRule="auto"/>
+        <w:rPr>
+          <w:rFonts w:ascii="Times New Roman" w:eastAsia="Times New Roman" w:hAnsi="Times New Roman" w:cs="Times New Roman"/>
+          <w:sz w:val="24"/>
+          <w:szCs w:val="24"/>
+        </w:rPr>
+      </w:pPr>
+      <w:r>
+        <w:rPr>
+          <w:rFonts w:ascii="Times New Roman" w:eastAsia="Times New Roman" w:hAnsi="Times New Roman" w:cs="Times New Roman"/>
+          <w:sz w:val="24"/>
+          <w:szCs w:val="24"/>
+        </w:rPr>
+        <w:t>146 records</w:t>
+      </w:r>
+    </w:p>
+    <w:p>
+      <w:pPr>
+        <w:numPr>
+          <w:ilvl w:val="1"/>
+          <w:numId w:val="40"/>
+        </w:numPr>
+        <w:spacing w:after="0" w:line="240" w:lineRule="auto"/>
+        <w:rPr>
+          <w:rFonts w:ascii="Times New Roman" w:eastAsia="Times New Roman" w:hAnsi="Times New Roman" w:cs="Times New Roman"/>
+          <w:sz w:val="24"/>
+          <w:szCs w:val="24"/>
+        </w:rPr>
+      </w:pPr>
+      <w:r>
+        <w:rPr>
+          <w:rFonts w:ascii="Times New Roman" w:eastAsia="Times New Roman" w:hAnsi="Times New Roman" w:cs="Times New Roman"/>
+          <w:sz w:val="24"/>
+          <w:szCs w:val="24"/>
+        </w:rPr>
+        <w:t>32 equipment</w:t>
+      </w:r>
+    </w:p>
+    <w:p>
+      <w:pPr>
+        <w:numPr>
+          <w:ilvl w:val="1"/>
+          <w:numId w:val="40"/>
+        </w:numPr>
+        <w:spacing w:after="0" w:line="240" w:lineRule="auto"/>
+        <w:rPr>
+          <w:rFonts w:ascii="Times New Roman" w:eastAsia="Times New Roman" w:hAnsi="Times New Roman" w:cs="Times New Roman"/>
+          <w:sz w:val="24"/>
+          <w:szCs w:val="24"/>
+        </w:rPr>
+      </w:pPr>
+      <w:r>
+        <w:rPr>
+          <w:rFonts w:ascii="Times New Roman" w:eastAsia="Times New Roman" w:hAnsi="Times New Roman" w:cs="Times New Roman"/>
+          <w:sz w:val="24"/>
+          <w:szCs w:val="24"/>
+        </w:rPr>
+        <w:t>3-month range</w:t>
+      </w:r>
+    </w:p>
+    <w:p>
+      <w:pPr>
+        <w:spacing w:after="0" w:line="240" w:lineRule="auto"/>
+        <w:rPr>
+          <w:rFonts w:ascii="Times New Roman" w:eastAsia="Times New Roman" w:hAnsi="Times New Roman" w:cs="Times New Roman"/>
+          <w:sz w:val="24"/>
+          <w:szCs w:val="24"/>
+        </w:rPr>
+      </w:pPr>
+    </w:p>
+    <w:p>
+      <w:pPr>
+        <w:spacing w:after="0" w:line="240" w:lineRule="auto"/>
+        <w:outlineLvl w:val="2"/>
+        <w:rPr>
+          <w:rFonts w:ascii="Times New Roman" w:eastAsia="Times New Roman" w:hAnsi="Times New Roman" w:cs="Times New Roman"/>
+          <w:b/>
+          <w:bCs/>
+          <w:sz w:val="27"/>
+          <w:szCs w:val="27"/>
+        </w:rPr>
+      </w:pPr>
+      <w:r>
+        <w:rPr>
+          <w:rFonts w:ascii="Times New Roman" w:eastAsia="Times New Roman" w:hAnsi="Times New Roman" w:cs="Times New Roman"/>
+          <w:b/>
+          <w:bCs/>
+          <w:sz w:val="27"/>
+          <w:szCs w:val="27"/>
+        </w:rPr>
+        <w:t>Data Flow Confirmation</w:t>
+      </w:r>
+    </w:p>
+    <w:p>
+      <w:pPr>
+        <w:tabs>
+          <w:tab w:val="left" w:pos="916"/>
+          <w:tab w:val="left" w:pos="1832"/>
+          <w:tab w:val="left" w:pos="2748"/>
+          <w:tab w:val="left" w:pos="3664"/>
+          <w:tab w:val="left" w:pos="4580"/>
+          <w:tab w:val="left" w:pos="5496"/>
+          <w:tab w:val="left" w:pos="6412"/>
+          <w:tab w:val="left" w:pos="7328"/>
+          <w:tab w:val="left" w:pos="8244"/>
+          <w:tab w:val="left" w:pos="9160"/>
+          <w:tab w:val="left" w:pos="10076"/>
+          <w:tab w:val="left" w:pos="10992"/>
+          <w:tab w:val="left" w:pos="11908"/>
+          <w:tab w:val="left" w:pos="12824"/>
+          <w:tab w:val="left" w:pos="13740"/>
+          <w:tab w:val="left" w:pos="14656"/>
+        </w:tabs>
+        <w:spacing w:after="0" w:line="240" w:lineRule="auto"/>
+        <w:rPr>
+          <w:rFonts w:ascii="Times New Roman" w:eastAsia="Times New Roman" w:hAnsi="Times New Roman" w:cs="Times New Roman"/>
+          <w:sz w:val="20"/>
+          <w:szCs w:val="20"/>
+        </w:rPr>
+      </w:pPr>
+      <w:r>
+        <w:rPr>
+          <w:rFonts w:ascii="Times New Roman" w:eastAsia="Times New Roman" w:hAnsi="Times New Roman" w:cs="Times New Roman"/>
+          <w:sz w:val="20"/>
+          <w:szCs w:val="20"/>
+        </w:rPr>
+        <w:t>Data Sources → Ingestion → Feature Store → Profiling → ML/Rules → Dashboard → Export</w:t>
+      </w:r>
+    </w:p>
+    <w:p>
+      <w:pPr>
+        <w:tabs>
+          <w:tab w:val="left" w:pos="916"/>
+          <w:tab w:val="left" w:pos="1832"/>
+          <w:tab w:val="left" w:pos="2748"/>
+          <w:tab w:val="left" w:pos="3664"/>
+          <w:tab w:val="left" w:pos="4580"/>
+          <w:tab w:val="left" w:pos="5496"/>
+          <w:tab w:val="left" w:pos="6412"/>
+          <w:tab w:val="left" w:pos="7328"/>
+          <w:tab w:val="left" w:pos="8244"/>
+          <w:tab w:val="left" w:pos="9160"/>
+          <w:tab w:val="left" w:pos="10076"/>
+          <w:tab w:val="left" w:pos="10992"/>
+          <w:tab w:val="left" w:pos="11908"/>
+          <w:tab w:val="left" w:pos="12824"/>
+          <w:tab w:val="left" w:pos="13740"/>
+          <w:tab w:val="left" w:pos="14656"/>
+        </w:tabs>
+        <w:spacing w:after="0" w:line="240" w:lineRule="auto"/>
+        <w:rPr>
+          <w:rFonts w:ascii="Times New Roman" w:eastAsia="Times New Roman" w:hAnsi="Times New Roman" w:cs="Times New Roman"/>
+          <w:sz w:val="20"/>
+          <w:szCs w:val="20"/>
+        </w:rPr>
+      </w:pPr>
+    </w:p>
+    <w:p>
+      <w:pPr>
+        <w:spacing w:after="0" w:line="240" w:lineRule="auto"/>
+        <w:outlineLvl w:val="2"/>
+        <w:rPr>
+          <w:rFonts w:ascii="Times New Roman" w:eastAsia="Times New Roman" w:hAnsi="Times New Roman" w:cs="Times New Roman"/>
+          <w:b/>
+          <w:bCs/>
+          <w:sz w:val="27"/>
+          <w:szCs w:val="27"/>
+        </w:rPr>
+      </w:pPr>
+      <w:r>
+        <w:rPr>
+          <w:rFonts w:ascii="Times New Roman" w:eastAsia="Times New Roman" w:hAnsi="Times New Roman" w:cs="Times New Roman"/>
+          <w:b/>
+          <w:bCs/>
+          <w:sz w:val="27"/>
+          <w:szCs w:val="27"/>
+        </w:rPr>
+        <w:t>Key Observations</w:t>
+      </w:r>
+    </w:p>
+    <w:p>
+      <w:pPr>
+        <w:numPr>
+          <w:ilvl w:val="0"/>
+          <w:numId w:val="41"/>
+        </w:numPr>
+        <w:spacing w:after="0" w:line="240" w:lineRule="auto"/>
+        <w:rPr>
+          <w:rFonts w:ascii="Times New Roman" w:eastAsia="Times New Roman" w:hAnsi="Times New Roman" w:cs="Times New Roman"/>
+          <w:sz w:val="24"/>
+          <w:szCs w:val="24"/>
+        </w:rPr>
+      </w:pPr>
+      <w:r>
+        <w:rPr>
+          <w:rFonts w:ascii="Times New Roman" w:eastAsia="Times New Roman" w:hAnsi="Times New Roman" w:cs="Times New Roman"/>
+          <w:sz w:val="24"/>
+          <w:szCs w:val="24"/>
+        </w:rPr>
+        <w:t>Data is suitable for time-based analytics</w:t>
+      </w:r>
+    </w:p>
+    <w:p>
+      <w:pPr>
+        <w:numPr>
+          <w:ilvl w:val="0"/>
+          <w:numId w:val="41"/>
+        </w:numPr>
+        <w:spacing w:after="0" w:line="240" w:lineRule="auto"/>
+        <w:rPr>
+          <w:rFonts w:ascii="Times New Roman" w:eastAsia="Times New Roman" w:hAnsi="Times New Roman" w:cs="Times New Roman"/>
+          <w:sz w:val="24"/>
+          <w:szCs w:val="24"/>
+        </w:rPr>
+      </w:pPr>
+      <w:r>
+        <w:rPr>
+          <w:rFonts w:ascii="Times New Roman" w:eastAsia="Times New Roman" w:hAnsi="Times New Roman" w:cs="Times New Roman"/>
+          <w:sz w:val="24"/>
+          <w:szCs w:val="24"/>
+        </w:rPr>
+        <w:t>Excel remains semi-structured and requires careful handling</w:t>
+      </w:r>
+    </w:p>
+    <w:p>
+      <w:pPr>
+        <w:numPr>
+          <w:ilvl w:val="0"/>
+          <w:numId w:val="41"/>
+        </w:numPr>
+        <w:spacing w:after="0" w:line="240" w:lineRule="auto"/>
+        <w:rPr>
+          <w:rFonts w:ascii="Times New Roman" w:eastAsia="Times New Roman" w:hAnsi="Times New Roman" w:cs="Times New Roman"/>
+          <w:sz w:val="24"/>
+          <w:szCs w:val="24"/>
+        </w:rPr>
+      </w:pPr>
+      <w:r>
+        <w:rPr>
+          <w:rFonts w:ascii="Times New Roman" w:hAnsi="Times New Roman" w:cs="Times New Roman"/>
+        </w:rPr>
+        <w:t>All sources support offline processing</w:t>
       </w:r>
     </w:p>
     <w:p>
       <w:pPr>
         <w:pStyle w:val="Heading3"/>
       </w:pPr>
+      <w:bookmarkStart w:id="0" w:name="_GoBack"/>
+      <w:bookmarkEnd w:id="0"/>
     </w:p>
     <w:p>
       <w:pPr>
@@ -5320,6 +6247,119 @@
     </w:lvl>
   </w:abstractNum>
   <w:abstractNum w:abstractNumId="6" w15:restartNumberingAfterBreak="0">
+    <w:nsid w:val="0C05604B"/>
+    <w:multiLevelType w:val="hybridMultilevel"/>
+    <w:tmpl w:val="C0DE9AC4"/>
+    <w:lvl w:ilvl="0" w:tplc="04090001">
+      <w:start w:val="1"/>
+      <w:numFmt w:val="bullet"/>
+      <w:lvlText w:val=""/>
+      <w:lvlJc w:val="left"/>
+      <w:pPr>
+        <w:ind w:left="720" w:hanging="360"/>
+      </w:pPr>
+      <w:rPr>
+        <w:rFonts w:ascii="Symbol" w:hAnsi="Symbol" w:hint="default"/>
+      </w:rPr>
+    </w:lvl>
+    <w:lvl w:ilvl="1" w:tplc="04090003" w:tentative="1">
+      <w:start w:val="1"/>
+      <w:numFmt w:val="bullet"/>
+      <w:lvlText w:val="o"/>
+      <w:lvlJc w:val="left"/>
+      <w:pPr>
+        <w:ind w:left="1440" w:hanging="360"/>
+      </w:pPr>
+      <w:rPr>
+        <w:rFonts w:ascii="Courier New" w:hAnsi="Courier New" w:cs="Courier New" w:hint="default"/>
+      </w:rPr>
+    </w:lvl>
+    <w:lvl w:ilvl="2" w:tplc="04090005" w:tentative="1">
+      <w:start w:val="1"/>
+      <w:numFmt w:val="bullet"/>
+      <w:lvlText w:val=""/>
+      <w:lvlJc w:val="left"/>
+      <w:pPr>
+        <w:ind w:left="2160" w:hanging="360"/>
+      </w:pPr>
+      <w:rPr>
+        <w:rFonts w:ascii="Wingdings" w:hAnsi="Wingdings" w:hint="default"/>
+      </w:rPr>
+    </w:lvl>
+    <w:lvl w:ilvl="3" w:tplc="04090001" w:tentative="1">
+      <w:start w:val="1"/>
+      <w:numFmt w:val="bullet"/>
+      <w:lvlText w:val=""/>
+      <w:lvlJc w:val="left"/>
+      <w:pPr>
+        <w:ind w:left="2880" w:hanging="360"/>
+      </w:pPr>
+      <w:rPr>
+        <w:rFonts w:ascii="Symbol" w:hAnsi="Symbol" w:hint="default"/>
+      </w:rPr>
+    </w:lvl>
+    <w:lvl w:ilvl="4" w:tplc="04090003" w:tentative="1">
+      <w:start w:val="1"/>
+      <w:numFmt w:val="bullet"/>
+      <w:lvlText w:val="o"/>
+      <w:lvlJc w:val="left"/>
+      <w:pPr>
+        <w:ind w:left="3600" w:hanging="360"/>
+      </w:pPr>
+      <w:rPr>
+        <w:rFonts w:ascii="Courier New" w:hAnsi="Courier New" w:cs="Courier New" w:hint="default"/>
+      </w:rPr>
+    </w:lvl>
+    <w:lvl w:ilvl="5" w:tplc="04090005" w:tentative="1">
+      <w:start w:val="1"/>
+      <w:numFmt w:val="bullet"/>
+      <w:lvlText w:val=""/>
+      <w:lvlJc w:val="left"/>
+      <w:pPr>
+        <w:ind w:left="4320" w:hanging="360"/>
+      </w:pPr>
+      <w:rPr>
+        <w:rFonts w:ascii="Wingdings" w:hAnsi="Wingdings" w:hint="default"/>
+      </w:rPr>
+    </w:lvl>
+    <w:lvl w:ilvl="6" w:tplc="04090001" w:tentative="1">
+      <w:start w:val="1"/>
+      <w:numFmt w:val="bullet"/>
+      <w:lvlText w:val=""/>
+      <w:lvlJc w:val="left"/>
+      <w:pPr>
+        <w:ind w:left="5040" w:hanging="360"/>
+      </w:pPr>
+      <w:rPr>
+        <w:rFonts w:ascii="Symbol" w:hAnsi="Symbol" w:hint="default"/>
+      </w:rPr>
+    </w:lvl>
+    <w:lvl w:ilvl="7" w:tplc="04090003" w:tentative="1">
+      <w:start w:val="1"/>
+      <w:numFmt w:val="bullet"/>
+      <w:lvlText w:val="o"/>
+      <w:lvlJc w:val="left"/>
+      <w:pPr>
+        <w:ind w:left="5760" w:hanging="360"/>
+      </w:pPr>
+      <w:rPr>
+        <w:rFonts w:ascii="Courier New" w:hAnsi="Courier New" w:cs="Courier New" w:hint="default"/>
+      </w:rPr>
+    </w:lvl>
+    <w:lvl w:ilvl="8" w:tplc="04090005" w:tentative="1">
+      <w:start w:val="1"/>
+      <w:numFmt w:val="bullet"/>
+      <w:lvlText w:val=""/>
+      <w:lvlJc w:val="left"/>
+      <w:pPr>
+        <w:ind w:left="6480" w:hanging="360"/>
+      </w:pPr>
+      <w:rPr>
+        <w:rFonts w:ascii="Wingdings" w:hAnsi="Wingdings" w:hint="default"/>
+      </w:rPr>
+    </w:lvl>
+  </w:abstractNum>
+  <w:abstractNum w:abstractNumId="7" w15:restartNumberingAfterBreak="0">
     <w:nsid w:val="0CDB645A"/>
     <w:multiLevelType w:val="multilevel"/>
     <w:tmpl w:val="2FC4D6F8"/>
@@ -5468,7 +6508,7 @@
       </w:rPr>
     </w:lvl>
   </w:abstractNum>
-  <w:abstractNum w:abstractNumId="7" w15:restartNumberingAfterBreak="0">
+  <w:abstractNum w:abstractNumId="8" w15:restartNumberingAfterBreak="0">
     <w:nsid w:val="0E893F49"/>
     <w:multiLevelType w:val="multilevel"/>
     <w:tmpl w:val="42A40B34"/>
@@ -5617,7 +6657,7 @@
       </w:rPr>
     </w:lvl>
   </w:abstractNum>
-  <w:abstractNum w:abstractNumId="8" w15:restartNumberingAfterBreak="0">
+  <w:abstractNum w:abstractNumId="9" w15:restartNumberingAfterBreak="0">
     <w:nsid w:val="0FE44505"/>
     <w:multiLevelType w:val="multilevel"/>
     <w:tmpl w:val="2A346502"/>
@@ -5766,7 +6806,7 @@
       </w:rPr>
     </w:lvl>
   </w:abstractNum>
-  <w:abstractNum w:abstractNumId="9" w15:restartNumberingAfterBreak="0">
+  <w:abstractNum w:abstractNumId="10" w15:restartNumberingAfterBreak="0">
     <w:nsid w:val="152B55E5"/>
     <w:multiLevelType w:val="multilevel"/>
     <w:tmpl w:val="046295AE"/>
@@ -5915,7 +6955,156 @@
       </w:rPr>
     </w:lvl>
   </w:abstractNum>
-  <w:abstractNum w:abstractNumId="10" w15:restartNumberingAfterBreak="0">
+  <w:abstractNum w:abstractNumId="11" w15:restartNumberingAfterBreak="0">
+    <w:nsid w:val="16F03C98"/>
+    <w:multiLevelType w:val="multilevel"/>
+    <w:tmpl w:val="C2EE9E46"/>
+    <w:lvl w:ilvl="0">
+      <w:start w:val="1"/>
+      <w:numFmt w:val="bullet"/>
+      <w:lvlText w:val=""/>
+      <w:lvlJc w:val="left"/>
+      <w:pPr>
+        <w:tabs>
+          <w:tab w:val="num" w:pos="720"/>
+        </w:tabs>
+        <w:ind w:left="720" w:hanging="360"/>
+      </w:pPr>
+      <w:rPr>
+        <w:rFonts w:ascii="Symbol" w:hAnsi="Symbol" w:hint="default"/>
+        <w:sz w:val="20"/>
+      </w:rPr>
+    </w:lvl>
+    <w:lvl w:ilvl="1">
+      <w:start w:val="1"/>
+      <w:numFmt w:val="bullet"/>
+      <w:lvlText w:val="o"/>
+      <w:lvlJc w:val="left"/>
+      <w:pPr>
+        <w:tabs>
+          <w:tab w:val="num" w:pos="1440"/>
+        </w:tabs>
+        <w:ind w:left="1440" w:hanging="360"/>
+      </w:pPr>
+      <w:rPr>
+        <w:rFonts w:ascii="Courier New" w:hAnsi="Courier New" w:hint="default"/>
+        <w:sz w:val="20"/>
+      </w:rPr>
+    </w:lvl>
+    <w:lvl w:ilvl="2" w:tentative="1">
+      <w:start w:val="1"/>
+      <w:numFmt w:val="bullet"/>
+      <w:lvlText w:val=""/>
+      <w:lvlJc w:val="left"/>
+      <w:pPr>
+        <w:tabs>
+          <w:tab w:val="num" w:pos="2160"/>
+        </w:tabs>
+        <w:ind w:left="2160" w:hanging="360"/>
+      </w:pPr>
+      <w:rPr>
+        <w:rFonts w:ascii="Wingdings" w:hAnsi="Wingdings" w:hint="default"/>
+        <w:sz w:val="20"/>
+      </w:rPr>
+    </w:lvl>
+    <w:lvl w:ilvl="3" w:tentative="1">
+      <w:start w:val="1"/>
+      <w:numFmt w:val="bullet"/>
+      <w:lvlText w:val=""/>
+      <w:lvlJc w:val="left"/>
+      <w:pPr>
+        <w:tabs>
+          <w:tab w:val="num" w:pos="2880"/>
+        </w:tabs>
+        <w:ind w:left="2880" w:hanging="360"/>
+      </w:pPr>
+      <w:rPr>
+        <w:rFonts w:ascii="Wingdings" w:hAnsi="Wingdings" w:hint="default"/>
+        <w:sz w:val="20"/>
+      </w:rPr>
+    </w:lvl>
+    <w:lvl w:ilvl="4" w:tentative="1">
+      <w:start w:val="1"/>
+      <w:numFmt w:val="bullet"/>
+      <w:lvlText w:val=""/>
+      <w:lvlJc w:val="left"/>
+      <w:pPr>
+        <w:tabs>
+          <w:tab w:val="num" w:pos="3600"/>
+        </w:tabs>
+        <w:ind w:left="3600" w:hanging="360"/>
+      </w:pPr>
+      <w:rPr>
+        <w:rFonts w:ascii="Wingdings" w:hAnsi="Wingdings" w:hint="default"/>
+        <w:sz w:val="20"/>
+      </w:rPr>
+    </w:lvl>
+    <w:lvl w:ilvl="5" w:tentative="1">
+      <w:start w:val="1"/>
+      <w:numFmt w:val="bullet"/>
+      <w:lvlText w:val=""/>
+      <w:lvlJc w:val="left"/>
+      <w:pPr>
+        <w:tabs>
+          <w:tab w:val="num" w:pos="4320"/>
+        </w:tabs>
+        <w:ind w:left="4320" w:hanging="360"/>
+      </w:pPr>
+      <w:rPr>
+        <w:rFonts w:ascii="Wingdings" w:hAnsi="Wingdings" w:hint="default"/>
+        <w:sz w:val="20"/>
+      </w:rPr>
+    </w:lvl>
+    <w:lvl w:ilvl="6" w:tentative="1">
+      <w:start w:val="1"/>
+      <w:numFmt w:val="bullet"/>
+      <w:lvlText w:val=""/>
+      <w:lvlJc w:val="left"/>
+      <w:pPr>
+        <w:tabs>
+          <w:tab w:val="num" w:pos="5040"/>
+        </w:tabs>
+        <w:ind w:left="5040" w:hanging="360"/>
+      </w:pPr>
+      <w:rPr>
+        <w:rFonts w:ascii="Wingdings" w:hAnsi="Wingdings" w:hint="default"/>
+        <w:sz w:val="20"/>
+      </w:rPr>
+    </w:lvl>
+    <w:lvl w:ilvl="7" w:tentative="1">
+      <w:start w:val="1"/>
+      <w:numFmt w:val="bullet"/>
+      <w:lvlText w:val=""/>
+      <w:lvlJc w:val="left"/>
+      <w:pPr>
+        <w:tabs>
+          <w:tab w:val="num" w:pos="5760"/>
+        </w:tabs>
+        <w:ind w:left="5760" w:hanging="360"/>
+      </w:pPr>
+      <w:rPr>
+        <w:rFonts w:ascii="Wingdings" w:hAnsi="Wingdings" w:hint="default"/>
+        <w:sz w:val="20"/>
+      </w:rPr>
+    </w:lvl>
+    <w:lvl w:ilvl="8" w:tentative="1">
+      <w:start w:val="1"/>
+      <w:numFmt w:val="bullet"/>
+      <w:lvlText w:val=""/>
+      <w:lvlJc w:val="left"/>
+      <w:pPr>
+        <w:tabs>
+          <w:tab w:val="num" w:pos="6480"/>
+        </w:tabs>
+        <w:ind w:left="6480" w:hanging="360"/>
+      </w:pPr>
+      <w:rPr>
+        <w:rFonts w:ascii="Wingdings" w:hAnsi="Wingdings" w:hint="default"/>
+        <w:sz w:val="20"/>
+      </w:rPr>
+    </w:lvl>
+  </w:abstractNum>
+  <w:abstractNum w:abstractNumId="12" w15:restartNumberingAfterBreak="0">
     <w:nsid w:val="199B7F89"/>
     <w:multiLevelType w:val="multilevel"/>
     <w:tmpl w:val="20AA80F2"/>
@@ -6064,7 +7253,7 @@
       </w:rPr>
     </w:lvl>
   </w:abstractNum>
-  <w:abstractNum w:abstractNumId="11" w15:restartNumberingAfterBreak="0">
+  <w:abstractNum w:abstractNumId="13" w15:restartNumberingAfterBreak="0">
     <w:nsid w:val="19A762C8"/>
     <w:multiLevelType w:val="multilevel"/>
     <w:tmpl w:val="A82E7BB4"/>
@@ -6213,7 +7402,7 @@
       </w:rPr>
     </w:lvl>
   </w:abstractNum>
-  <w:abstractNum w:abstractNumId="12" w15:restartNumberingAfterBreak="0">
+  <w:abstractNum w:abstractNumId="14" w15:restartNumberingAfterBreak="0">
     <w:nsid w:val="1AE27D26"/>
     <w:multiLevelType w:val="multilevel"/>
     <w:tmpl w:val="D3CA648A"/>
@@ -6362,7 +7551,7 @@
       </w:rPr>
     </w:lvl>
   </w:abstractNum>
-  <w:abstractNum w:abstractNumId="13" w15:restartNumberingAfterBreak="0">
+  <w:abstractNum w:abstractNumId="15" w15:restartNumberingAfterBreak="0">
     <w:nsid w:val="24312ED9"/>
     <w:multiLevelType w:val="multilevel"/>
     <w:tmpl w:val="D9ECBDDE"/>
@@ -6511,7 +7700,7 @@
       </w:rPr>
     </w:lvl>
   </w:abstractNum>
-  <w:abstractNum w:abstractNumId="14" w15:restartNumberingAfterBreak="0">
+  <w:abstractNum w:abstractNumId="16" w15:restartNumberingAfterBreak="0">
     <w:nsid w:val="289E006F"/>
     <w:multiLevelType w:val="multilevel"/>
     <w:tmpl w:val="9F308DA0"/>
@@ -6628,7 +7817,7 @@
       </w:pPr>
     </w:lvl>
   </w:abstractNum>
-  <w:abstractNum w:abstractNumId="15" w15:restartNumberingAfterBreak="0">
+  <w:abstractNum w:abstractNumId="17" w15:restartNumberingAfterBreak="0">
     <w:nsid w:val="3BDC2785"/>
     <w:multiLevelType w:val="multilevel"/>
     <w:tmpl w:val="BE844A56"/>
@@ -6777,7 +7966,7 @@
       </w:rPr>
     </w:lvl>
   </w:abstractNum>
-  <w:abstractNum w:abstractNumId="16" w15:restartNumberingAfterBreak="0">
+  <w:abstractNum w:abstractNumId="18" w15:restartNumberingAfterBreak="0">
     <w:nsid w:val="3BDF28D1"/>
     <w:multiLevelType w:val="multilevel"/>
     <w:tmpl w:val="155497D2"/>
@@ -6926,7 +8115,7 @@
       </w:rPr>
     </w:lvl>
   </w:abstractNum>
-  <w:abstractNum w:abstractNumId="17" w15:restartNumberingAfterBreak="0">
+  <w:abstractNum w:abstractNumId="19" w15:restartNumberingAfterBreak="0">
     <w:nsid w:val="3E5A43D8"/>
     <w:multiLevelType w:val="multilevel"/>
     <w:tmpl w:val="EB2C7E9E"/>
@@ -7075,7 +8264,7 @@
       </w:rPr>
     </w:lvl>
   </w:abstractNum>
-  <w:abstractNum w:abstractNumId="18" w15:restartNumberingAfterBreak="0">
+  <w:abstractNum w:abstractNumId="20" w15:restartNumberingAfterBreak="0">
     <w:nsid w:val="42A8624D"/>
     <w:multiLevelType w:val="multilevel"/>
     <w:tmpl w:val="BAACE418"/>
@@ -7224,7 +8413,7 @@
       </w:rPr>
     </w:lvl>
   </w:abstractNum>
-  <w:abstractNum w:abstractNumId="19" w15:restartNumberingAfterBreak="0">
+  <w:abstractNum w:abstractNumId="21" w15:restartNumberingAfterBreak="0">
     <w:nsid w:val="47426082"/>
     <w:multiLevelType w:val="hybridMultilevel"/>
     <w:tmpl w:val="287A55F6"/>
@@ -7337,7 +8526,7 @@
       </w:rPr>
     </w:lvl>
   </w:abstractNum>
-  <w:abstractNum w:abstractNumId="20" w15:restartNumberingAfterBreak="0">
+  <w:abstractNum w:abstractNumId="22" w15:restartNumberingAfterBreak="0">
     <w:nsid w:val="4826145B"/>
     <w:multiLevelType w:val="multilevel"/>
     <w:tmpl w:val="2A346502"/>
@@ -7486,7 +8675,7 @@
       </w:rPr>
     </w:lvl>
   </w:abstractNum>
-  <w:abstractNum w:abstractNumId="21" w15:restartNumberingAfterBreak="0">
+  <w:abstractNum w:abstractNumId="23" w15:restartNumberingAfterBreak="0">
     <w:nsid w:val="488C6048"/>
     <w:multiLevelType w:val="multilevel"/>
     <w:tmpl w:val="D0A2634A"/>
@@ -7635,7 +8824,7 @@
       </w:rPr>
     </w:lvl>
   </w:abstractNum>
-  <w:abstractNum w:abstractNumId="22" w15:restartNumberingAfterBreak="0">
+  <w:abstractNum w:abstractNumId="24" w15:restartNumberingAfterBreak="0">
     <w:nsid w:val="493A0D09"/>
     <w:multiLevelType w:val="multilevel"/>
     <w:tmpl w:val="86529C48"/>
@@ -7784,7 +8973,7 @@
       </w:rPr>
     </w:lvl>
   </w:abstractNum>
-  <w:abstractNum w:abstractNumId="23" w15:restartNumberingAfterBreak="0">
+  <w:abstractNum w:abstractNumId="25" w15:restartNumberingAfterBreak="0">
     <w:nsid w:val="4A3D569D"/>
     <w:multiLevelType w:val="multilevel"/>
     <w:tmpl w:val="13D4042A"/>
@@ -7933,7 +9122,156 @@
       </w:rPr>
     </w:lvl>
   </w:abstractNum>
-  <w:abstractNum w:abstractNumId="24" w15:restartNumberingAfterBreak="0">
+  <w:abstractNum w:abstractNumId="26" w15:restartNumberingAfterBreak="0">
+    <w:nsid w:val="4C6055FC"/>
+    <w:multiLevelType w:val="multilevel"/>
+    <w:tmpl w:val="FDE4D6AE"/>
+    <w:lvl w:ilvl="0">
+      <w:start w:val="1"/>
+      <w:numFmt w:val="bullet"/>
+      <w:lvlText w:val=""/>
+      <w:lvlJc w:val="left"/>
+      <w:pPr>
+        <w:tabs>
+          <w:tab w:val="num" w:pos="720"/>
+        </w:tabs>
+        <w:ind w:left="720" w:hanging="360"/>
+      </w:pPr>
+      <w:rPr>
+        <w:rFonts w:ascii="Symbol" w:hAnsi="Symbol" w:hint="default"/>
+        <w:sz w:val="20"/>
+      </w:rPr>
+    </w:lvl>
+    <w:lvl w:ilvl="1" w:tentative="1">
+      <w:start w:val="1"/>
+      <w:numFmt w:val="bullet"/>
+      <w:lvlText w:val="o"/>
+      <w:lvlJc w:val="left"/>
+      <w:pPr>
+        <w:tabs>
+          <w:tab w:val="num" w:pos="1440"/>
+        </w:tabs>
+        <w:ind w:left="1440" w:hanging="360"/>
+      </w:pPr>
+      <w:rPr>
+        <w:rFonts w:ascii="Courier New" w:hAnsi="Courier New" w:hint="default"/>
+        <w:sz w:val="20"/>
+      </w:rPr>
+    </w:lvl>
+    <w:lvl w:ilvl="2" w:tentative="1">
+      <w:start w:val="1"/>
+      <w:numFmt w:val="bullet"/>
+      <w:lvlText w:val=""/>
+      <w:lvlJc w:val="left"/>
+      <w:pPr>
+        <w:tabs>
+          <w:tab w:val="num" w:pos="2160"/>
+        </w:tabs>
+        <w:ind w:left="2160" w:hanging="360"/>
+      </w:pPr>
+      <w:rPr>
+        <w:rFonts w:ascii="Wingdings" w:hAnsi="Wingdings" w:hint="default"/>
+        <w:sz w:val="20"/>
+      </w:rPr>
+    </w:lvl>
+    <w:lvl w:ilvl="3" w:tentative="1">
+      <w:start w:val="1"/>
+      <w:numFmt w:val="bullet"/>
+      <w:lvlText w:val=""/>
+      <w:lvlJc w:val="left"/>
+      <w:pPr>
+        <w:tabs>
+          <w:tab w:val="num" w:pos="2880"/>
+        </w:tabs>
+        <w:ind w:left="2880" w:hanging="360"/>
+      </w:pPr>
+      <w:rPr>
+        <w:rFonts w:ascii="Wingdings" w:hAnsi="Wingdings" w:hint="default"/>
+        <w:sz w:val="20"/>
+      </w:rPr>
+    </w:lvl>
+    <w:lvl w:ilvl="4" w:tentative="1">
+      <w:start w:val="1"/>
+      <w:numFmt w:val="bullet"/>
+      <w:lvlText w:val=""/>
+      <w:lvlJc w:val="left"/>
+      <w:pPr>
+        <w:tabs>
+          <w:tab w:val="num" w:pos="3600"/>
+        </w:tabs>
+        <w:ind w:left="3600" w:hanging="360"/>
+      </w:pPr>
+      <w:rPr>
+        <w:rFonts w:ascii="Wingdings" w:hAnsi="Wingdings" w:hint="default"/>
+        <w:sz w:val="20"/>
+      </w:rPr>
+    </w:lvl>
+    <w:lvl w:ilvl="5" w:tentative="1">
+      <w:start w:val="1"/>
+      <w:numFmt w:val="bullet"/>
+      <w:lvlText w:val=""/>
+      <w:lvlJc w:val="left"/>
+      <w:pPr>
+        <w:tabs>
+          <w:tab w:val="num" w:pos="4320"/>
+        </w:tabs>
+        <w:ind w:left="4320" w:hanging="360"/>
+      </w:pPr>
+      <w:rPr>
+        <w:rFonts w:ascii="Wingdings" w:hAnsi="Wingdings" w:hint="default"/>
+        <w:sz w:val="20"/>
+      </w:rPr>
+    </w:lvl>
+    <w:lvl w:ilvl="6" w:tentative="1">
+      <w:start w:val="1"/>
+      <w:numFmt w:val="bullet"/>
+      <w:lvlText w:val=""/>
+      <w:lvlJc w:val="left"/>
+      <w:pPr>
+        <w:tabs>
+          <w:tab w:val="num" w:pos="5040"/>
+        </w:tabs>
+        <w:ind w:left="5040" w:hanging="360"/>
+      </w:pPr>
+      <w:rPr>
+        <w:rFonts w:ascii="Wingdings" w:hAnsi="Wingdings" w:hint="default"/>
+        <w:sz w:val="20"/>
+      </w:rPr>
+    </w:lvl>
+    <w:lvl w:ilvl="7" w:tentative="1">
+      <w:start w:val="1"/>
+      <w:numFmt w:val="bullet"/>
+      <w:lvlText w:val=""/>
+      <w:lvlJc w:val="left"/>
+      <w:pPr>
+        <w:tabs>
+          <w:tab w:val="num" w:pos="5760"/>
+        </w:tabs>
+        <w:ind w:left="5760" w:hanging="360"/>
+      </w:pPr>
+      <w:rPr>
+        <w:rFonts w:ascii="Wingdings" w:hAnsi="Wingdings" w:hint="default"/>
+        <w:sz w:val="20"/>
+      </w:rPr>
+    </w:lvl>
+    <w:lvl w:ilvl="8" w:tentative="1">
+      <w:start w:val="1"/>
+      <w:numFmt w:val="bullet"/>
+      <w:lvlText w:val=""/>
+      <w:lvlJc w:val="left"/>
+      <w:pPr>
+        <w:tabs>
+          <w:tab w:val="num" w:pos="6480"/>
+        </w:tabs>
+        <w:ind w:left="6480" w:hanging="360"/>
+      </w:pPr>
+      <w:rPr>
+        <w:rFonts w:ascii="Wingdings" w:hAnsi="Wingdings" w:hint="default"/>
+        <w:sz w:val="20"/>
+      </w:rPr>
+    </w:lvl>
+  </w:abstractNum>
+  <w:abstractNum w:abstractNumId="27" w15:restartNumberingAfterBreak="0">
     <w:nsid w:val="4E0A27B5"/>
     <w:multiLevelType w:val="multilevel"/>
     <w:tmpl w:val="2DB49E70"/>
@@ -8082,7 +9420,7 @@
       </w:rPr>
     </w:lvl>
   </w:abstractNum>
-  <w:abstractNum w:abstractNumId="25" w15:restartNumberingAfterBreak="0">
+  <w:abstractNum w:abstractNumId="28" w15:restartNumberingAfterBreak="0">
     <w:nsid w:val="4E3E795D"/>
     <w:multiLevelType w:val="multilevel"/>
     <w:tmpl w:val="6BDEC3FE"/>
@@ -8231,7 +9569,7 @@
       </w:rPr>
     </w:lvl>
   </w:abstractNum>
-  <w:abstractNum w:abstractNumId="26" w15:restartNumberingAfterBreak="0">
+  <w:abstractNum w:abstractNumId="29" w15:restartNumberingAfterBreak="0">
     <w:nsid w:val="5665309F"/>
     <w:multiLevelType w:val="multilevel"/>
     <w:tmpl w:val="F23A3184"/>
@@ -8380,7 +9718,7 @@
       </w:rPr>
     </w:lvl>
   </w:abstractNum>
-  <w:abstractNum w:abstractNumId="27" w15:restartNumberingAfterBreak="0">
+  <w:abstractNum w:abstractNumId="30" w15:restartNumberingAfterBreak="0">
     <w:nsid w:val="57B21EED"/>
     <w:multiLevelType w:val="multilevel"/>
     <w:tmpl w:val="35EC1916"/>
@@ -8529,7 +9867,7 @@
       </w:rPr>
     </w:lvl>
   </w:abstractNum>
-  <w:abstractNum w:abstractNumId="28" w15:restartNumberingAfterBreak="0">
+  <w:abstractNum w:abstractNumId="31" w15:restartNumberingAfterBreak="0">
     <w:nsid w:val="59A274A8"/>
     <w:multiLevelType w:val="multilevel"/>
     <w:tmpl w:val="2C923F90"/>
@@ -8678,7 +10016,7 @@
       </w:rPr>
     </w:lvl>
   </w:abstractNum>
-  <w:abstractNum w:abstractNumId="29" w15:restartNumberingAfterBreak="0">
+  <w:abstractNum w:abstractNumId="32" w15:restartNumberingAfterBreak="0">
     <w:nsid w:val="59DB6D6A"/>
     <w:multiLevelType w:val="multilevel"/>
     <w:tmpl w:val="97FE5C9C"/>
@@ -8827,7 +10165,7 @@
       </w:rPr>
     </w:lvl>
   </w:abstractNum>
-  <w:abstractNum w:abstractNumId="30" w15:restartNumberingAfterBreak="0">
+  <w:abstractNum w:abstractNumId="33" w15:restartNumberingAfterBreak="0">
     <w:nsid w:val="5E855459"/>
     <w:multiLevelType w:val="multilevel"/>
     <w:tmpl w:val="30F2FFFC"/>
@@ -8976,7 +10314,7 @@
       </w:rPr>
     </w:lvl>
   </w:abstractNum>
-  <w:abstractNum w:abstractNumId="31" w15:restartNumberingAfterBreak="0">
+  <w:abstractNum w:abstractNumId="34" w15:restartNumberingAfterBreak="0">
     <w:nsid w:val="61BF3478"/>
     <w:multiLevelType w:val="multilevel"/>
     <w:tmpl w:val="22B02AC8"/>
@@ -9125,7 +10463,7 @@
       </w:rPr>
     </w:lvl>
   </w:abstractNum>
-  <w:abstractNum w:abstractNumId="32" w15:restartNumberingAfterBreak="0">
+  <w:abstractNum w:abstractNumId="35" w15:restartNumberingAfterBreak="0">
     <w:nsid w:val="629543B9"/>
     <w:multiLevelType w:val="multilevel"/>
     <w:tmpl w:val="2A346502"/>
@@ -9274,7 +10612,7 @@
       </w:rPr>
     </w:lvl>
   </w:abstractNum>
-  <w:abstractNum w:abstractNumId="33" w15:restartNumberingAfterBreak="0">
+  <w:abstractNum w:abstractNumId="36" w15:restartNumberingAfterBreak="0">
     <w:nsid w:val="6AA0519F"/>
     <w:multiLevelType w:val="multilevel"/>
     <w:tmpl w:val="2A346502"/>
@@ -9423,7 +10761,7 @@
       </w:rPr>
     </w:lvl>
   </w:abstractNum>
-  <w:abstractNum w:abstractNumId="34" w15:restartNumberingAfterBreak="0">
+  <w:abstractNum w:abstractNumId="37" w15:restartNumberingAfterBreak="0">
     <w:nsid w:val="6B626DB3"/>
     <w:multiLevelType w:val="multilevel"/>
     <w:tmpl w:val="53380260"/>
@@ -9572,7 +10910,7 @@
       </w:rPr>
     </w:lvl>
   </w:abstractNum>
-  <w:abstractNum w:abstractNumId="35" w15:restartNumberingAfterBreak="0">
+  <w:abstractNum w:abstractNumId="38" w15:restartNumberingAfterBreak="0">
     <w:nsid w:val="6F991467"/>
     <w:multiLevelType w:val="multilevel"/>
     <w:tmpl w:val="BA584984"/>
@@ -9721,7 +11059,7 @@
       </w:rPr>
     </w:lvl>
   </w:abstractNum>
-  <w:abstractNum w:abstractNumId="36" w15:restartNumberingAfterBreak="0">
+  <w:abstractNum w:abstractNumId="39" w15:restartNumberingAfterBreak="0">
     <w:nsid w:val="7501785F"/>
     <w:multiLevelType w:val="multilevel"/>
     <w:tmpl w:val="70CCC7CE"/>
@@ -9870,7 +11208,7 @@
       </w:rPr>
     </w:lvl>
   </w:abstractNum>
-  <w:abstractNum w:abstractNumId="37" w15:restartNumberingAfterBreak="0">
+  <w:abstractNum w:abstractNumId="40" w15:restartNumberingAfterBreak="0">
     <w:nsid w:val="76724A06"/>
     <w:multiLevelType w:val="multilevel"/>
     <w:tmpl w:val="3B360860"/>
@@ -10019,7 +11357,7 @@
       </w:rPr>
     </w:lvl>
   </w:abstractNum>
-  <w:abstractNum w:abstractNumId="38" w15:restartNumberingAfterBreak="0">
+  <w:abstractNum w:abstractNumId="41" w15:restartNumberingAfterBreak="0">
     <w:nsid w:val="7F0B10D7"/>
     <w:multiLevelType w:val="multilevel"/>
     <w:tmpl w:val="783858F8"/>
@@ -10169,121 +11507,130 @@
     </w:lvl>
   </w:abstractNum>
   <w:num w:numId="1">
-    <w:abstractNumId w:val="35"/>
+    <w:abstractNumId w:val="38"/>
   </w:num>
   <w:num w:numId="2">
-    <w:abstractNumId w:val="29"/>
+    <w:abstractNumId w:val="32"/>
   </w:num>
   <w:num w:numId="3">
+    <w:abstractNumId w:val="14"/>
+  </w:num>
+  <w:num w:numId="4">
+    <w:abstractNumId w:val="7"/>
+  </w:num>
+  <w:num w:numId="5">
+    <w:abstractNumId w:val="17"/>
+  </w:num>
+  <w:num w:numId="6">
     <w:abstractNumId w:val="12"/>
   </w:num>
-  <w:num w:numId="4">
-    <w:abstractNumId w:val="6"/>
-  </w:num>
-  <w:num w:numId="5">
-    <w:abstractNumId w:val="15"/>
-  </w:num>
-  <w:num w:numId="6">
-    <w:abstractNumId w:val="10"/>
-  </w:num>
   <w:num w:numId="7">
-    <w:abstractNumId w:val="14"/>
+    <w:abstractNumId w:val="16"/>
   </w:num>
   <w:num w:numId="8">
     <w:abstractNumId w:val="5"/>
   </w:num>
   <w:num w:numId="9">
-    <w:abstractNumId w:val="36"/>
+    <w:abstractNumId w:val="39"/>
   </w:num>
   <w:num w:numId="10">
-    <w:abstractNumId w:val="21"/>
+    <w:abstractNumId w:val="23"/>
   </w:num>
   <w:num w:numId="11">
-    <w:abstractNumId w:val="16"/>
+    <w:abstractNumId w:val="18"/>
   </w:num>
   <w:num w:numId="12">
+    <w:abstractNumId w:val="30"/>
+  </w:num>
+  <w:num w:numId="13">
+    <w:abstractNumId w:val="33"/>
+  </w:num>
+  <w:num w:numId="14">
     <w:abstractNumId w:val="27"/>
   </w:num>
-  <w:num w:numId="13">
-    <w:abstractNumId w:val="30"/>
-  </w:num>
-  <w:num w:numId="14">
-    <w:abstractNumId w:val="24"/>
-  </w:num>
   <w:num w:numId="15">
-    <w:abstractNumId w:val="11"/>
+    <w:abstractNumId w:val="13"/>
   </w:num>
   <w:num w:numId="16">
-    <w:abstractNumId w:val="34"/>
+    <w:abstractNumId w:val="37"/>
   </w:num>
   <w:num w:numId="17">
-    <w:abstractNumId w:val="23"/>
+    <w:abstractNumId w:val="25"/>
   </w:num>
   <w:num w:numId="18">
     <w:abstractNumId w:val="0"/>
   </w:num>
   <w:num w:numId="19">
-    <w:abstractNumId w:val="38"/>
+    <w:abstractNumId w:val="41"/>
   </w:num>
   <w:num w:numId="20">
-    <w:abstractNumId w:val="18"/>
+    <w:abstractNumId w:val="20"/>
   </w:num>
   <w:num w:numId="21">
-    <w:abstractNumId w:val="37"/>
+    <w:abstractNumId w:val="40"/>
   </w:num>
   <w:num w:numId="22">
-    <w:abstractNumId w:val="31"/>
+    <w:abstractNumId w:val="34"/>
   </w:num>
   <w:num w:numId="23">
-    <w:abstractNumId w:val="26"/>
+    <w:abstractNumId w:val="29"/>
   </w:num>
   <w:num w:numId="24">
-    <w:abstractNumId w:val="7"/>
+    <w:abstractNumId w:val="8"/>
   </w:num>
   <w:num w:numId="25">
-    <w:abstractNumId w:val="28"/>
+    <w:abstractNumId w:val="31"/>
   </w:num>
   <w:num w:numId="26">
     <w:abstractNumId w:val="3"/>
   </w:num>
   <w:num w:numId="27">
-    <w:abstractNumId w:val="25"/>
+    <w:abstractNumId w:val="28"/>
   </w:num>
   <w:num w:numId="28">
-    <w:abstractNumId w:val="22"/>
+    <w:abstractNumId w:val="24"/>
   </w:num>
   <w:num w:numId="29">
     <w:abstractNumId w:val="4"/>
   </w:num>
   <w:num w:numId="30">
-    <w:abstractNumId w:val="9"/>
+    <w:abstractNumId w:val="10"/>
   </w:num>
   <w:num w:numId="31">
-    <w:abstractNumId w:val="13"/>
+    <w:abstractNumId w:val="15"/>
   </w:num>
   <w:num w:numId="32">
     <w:abstractNumId w:val="2"/>
   </w:num>
   <w:num w:numId="33">
-    <w:abstractNumId w:val="17"/>
+    <w:abstractNumId w:val="19"/>
   </w:num>
   <w:num w:numId="34">
     <w:abstractNumId w:val="1"/>
   </w:num>
   <w:num w:numId="35">
-    <w:abstractNumId w:val="33"/>
+    <w:abstractNumId w:val="36"/>
   </w:num>
   <w:num w:numId="36">
-    <w:abstractNumId w:val="32"/>
+    <w:abstractNumId w:val="35"/>
   </w:num>
   <w:num w:numId="37">
-    <w:abstractNumId w:val="20"/>
+    <w:abstractNumId w:val="22"/>
   </w:num>
   <w:num w:numId="38">
-    <w:abstractNumId w:val="8"/>
+    <w:abstractNumId w:val="9"/>
   </w:num>
   <w:num w:numId="39">
-    <w:abstractNumId w:val="19"/>
+    <w:abstractNumId w:val="21"/>
+  </w:num>
+  <w:num w:numId="40">
+    <w:abstractNumId w:val="11"/>
+  </w:num>
+  <w:num w:numId="41">
+    <w:abstractNumId w:val="26"/>
+  </w:num>
+  <w:num w:numId="42">
+    <w:abstractNumId w:val="6"/>
   </w:num>
 </w:numbering>
 </file>
@@ -10859,6 +12206,70 @@
       <w:szCs w:val="32"/>
     </w:rPr>
   </w:style>
+  <w:style w:type="paragraph" w:styleId="HTMLPreformatted">
+    <w:name w:val="HTML Preformatted"/>
+    <w:basedOn w:val="Normal"/>
+    <w:link w:val="HTMLPreformattedChar"/>
+    <w:uiPriority w:val="99"/>
+    <w:semiHidden/>
+    <w:unhideWhenUsed/>
+    <w:rsid w:val="0038035E"/>
+    <w:pPr>
+      <w:tabs>
+        <w:tab w:val="left" w:pos="916"/>
+        <w:tab w:val="left" w:pos="1832"/>
+        <w:tab w:val="left" w:pos="2748"/>
+        <w:tab w:val="left" w:pos="3664"/>
+        <w:tab w:val="left" w:pos="4580"/>
+        <w:tab w:val="left" w:pos="5496"/>
+        <w:tab w:val="left" w:pos="6412"/>
+        <w:tab w:val="left" w:pos="7328"/>
+        <w:tab w:val="left" w:pos="8244"/>
+        <w:tab w:val="left" w:pos="9160"/>
+        <w:tab w:val="left" w:pos="10076"/>
+        <w:tab w:val="left" w:pos="10992"/>
+        <w:tab w:val="left" w:pos="11908"/>
+        <w:tab w:val="left" w:pos="12824"/>
+        <w:tab w:val="left" w:pos="13740"/>
+        <w:tab w:val="left" w:pos="14656"/>
+      </w:tabs>
+      <w:spacing w:after="0" w:line="240" w:lineRule="auto"/>
+    </w:pPr>
+    <w:rPr>
+      <w:rFonts w:ascii="Courier New" w:eastAsia="Times New Roman" w:hAnsi="Courier New" w:cs="Courier New"/>
+      <w:sz w:val="20"/>
+      <w:szCs w:val="20"/>
+    </w:rPr>
+  </w:style>
+  <w:style w:type="character" w:customStyle="1" w:styleId="HTMLPreformattedChar">
+    <w:name w:val="HTML Preformatted Char"/>
+    <w:basedOn w:val="DefaultParagraphFont"/>
+    <w:link w:val="HTMLPreformatted"/>
+    <w:uiPriority w:val="99"/>
+    <w:semiHidden/>
+    <w:rsid w:val="0038035E"/>
+    <w:rPr>
+      <w:rFonts w:ascii="Courier New" w:eastAsia="Times New Roman" w:hAnsi="Courier New" w:cs="Courier New"/>
+      <w:sz w:val="20"/>
+      <w:szCs w:val="20"/>
+    </w:rPr>
+  </w:style>
+  <w:style w:type="character" w:customStyle="1" w:styleId="hljs-keyword">
+    <w:name w:val="hljs-keyword"/>
+    <w:basedOn w:val="DefaultParagraphFont"/>
+    <w:rsid w:val="0038035E"/>
+  </w:style>
+  <w:style w:type="paragraph" w:styleId="ListParagraph">
+    <w:name w:val="List Paragraph"/>
+    <w:basedOn w:val="Normal"/>
+    <w:uiPriority w:val="34"/>
+    <w:qFormat/>
+    <w:rsid w:val="0038035E"/>
+    <w:pPr>
+      <w:ind w:left="720"/>
+      <w:contextualSpacing/>
+    </w:pPr>
+  </w:style>
 </w:styles>
 </file>
 

</xml_diff>